<commit_message>
new word document for my project
</commit_message>
<xml_diff>
--- a/PhD files/Chikungunya Disease.docx
+++ b/PhD files/Chikungunya Disease.docx
@@ -2,7 +2,548 @@
 <file path=word/document.xml><?xml version="1.0" encoding="utf-8"?>
 <w:document xmlns:wpc="http://schemas.microsoft.com/office/word/2010/wordprocessingCanvas" xmlns:cx="http://schemas.microsoft.com/office/drawing/2014/chartex" xmlns:cx1="http://schemas.microsoft.com/office/drawing/2015/9/8/chartex" xmlns:cx2="http://schemas.microsoft.com/office/drawing/2015/10/21/chartex" xmlns:cx3="http://schemas.microsoft.com/office/drawing/2016/5/9/chartex" xmlns:cx4="http://schemas.microsoft.com/office/drawing/2016/5/10/chartex" xmlns:cx5="http://schemas.microsoft.com/office/drawing/2016/5/11/chartex" xmlns:cx6="http://schemas.microsoft.com/office/drawing/2016/5/12/chartex" xmlns:cx7="http://schemas.microsoft.com/office/drawing/2016/5/13/chartex" xmlns:cx8="http://schemas.microsoft.com/office/drawing/2016/5/14/chartex" xmlns:mc="http://schemas.openxmlformats.org/markup-compatibility/2006" xmlns:aink="http://schemas.microsoft.com/office/drawing/2016/ink" xmlns:am3d="http://schemas.microsoft.com/office/drawing/2017/model3d" xmlns:o="urn:schemas-microsoft-com:office:office" xmlns:oel="http://schemas.microsoft.com/office/2019/extlst" xmlns:r="http://schemas.openxmlformats.org/officeDocument/2006/relationships" xmlns:m="http://schemas.openxmlformats.org/officeDocument/2006/math" xmlns:v="urn:schemas-microsoft-com:vml" xmlns:wp14="http://schemas.microsoft.com/office/word/2010/wordprocessingDrawing" xmlns:wp="http://schemas.openxmlformats.org/drawingml/2006/wordprocessingDrawing" xmlns:w10="urn:schemas-microsoft-com:office:word" xmlns:w="http://schemas.openxmlformats.org/wordprocessingml/2006/main" xmlns:w14="http://schemas.microsoft.com/office/word/2010/wordml" xmlns:w15="http://schemas.microsoft.com/office/word/2012/wordml" xmlns:w16cex="http://schemas.microsoft.com/office/word/2018/wordml/cex" xmlns:w16cid="http://schemas.microsoft.com/office/word/2016/wordml/cid" xmlns:w16="http://schemas.microsoft.com/office/word/2018/wordml" xmlns:w16du="http://schemas.microsoft.com/office/word/2023/wordml/word16du" xmlns:w16sdtdh="http://schemas.microsoft.com/office/word/2020/wordml/sdtdatahash" xmlns:w16sdtfl="http://schemas.microsoft.com/office/word/2024/wordml/sdtformatlock" xmlns:w16se="http://schemas.microsoft.com/office/word/2015/wordml/symex" xmlns:wpg="http://schemas.microsoft.com/office/word/2010/wordprocessingGroup" xmlns:wpi="http://schemas.microsoft.com/office/word/2010/wordprocessingInk" xmlns:wne="http://schemas.microsoft.com/office/word/2006/wordml" xmlns:wps="http://schemas.microsoft.com/office/word/2010/wordprocessingShape" mc:Ignorable="w14 w15 w16se w16cid w16 w16cex w16sdtdh w16sdtfl w16du wp14">
   <w:body>
-    <w:p/>
+    <w:p>
+      <w:pPr>
+        <w:rPr>
+          <w:lang w:val="en-GB"/>
+        </w:rPr>
+      </w:pPr>
+      <w:r>
+        <w:rPr>
+          <w:lang w:val="en-GB"/>
+        </w:rPr>
+        <w:t>Introduction</w:t>
+      </w:r>
+    </w:p>
+    <w:p>
+      <w:pPr>
+        <w:rPr>
+          <w:lang w:val="en-GB"/>
+        </w:rPr>
+      </w:pPr>
+      <w:r>
+        <w:rPr>
+          <w:lang w:val="en-GB"/>
+        </w:rPr>
+        <w:t xml:space="preserve">Chikungunya is a mosquito-borne arboviral disease posing a global </w:t>
+      </w:r>
+      <w:r>
+        <w:rPr>
+          <w:lang w:val="en-GB"/>
+        </w:rPr>
+        <w:t xml:space="preserve">public </w:t>
+      </w:r>
+      <w:r>
+        <w:rPr>
+          <w:lang w:val="en-GB"/>
+        </w:rPr>
+        <w:t>health threa</w:t>
+      </w:r>
+      <w:r>
+        <w:rPr>
+          <w:lang w:val="en-GB"/>
+        </w:rPr>
+        <w:t xml:space="preserve">t </w:t>
+      </w:r>
+      <w:sdt>
+        <w:sdtPr>
+          <w:rPr>
+            <w:color w:val="000000"/>
+            <w:lang w:val="en-GB"/>
+          </w:rPr>
+          <w:tag w:val="MENDELEY_CITATION_v3_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"/>
+          <w:id w:val="-123850941"/>
+          <w:placeholder>
+            <w:docPart w:val="DefaultPlaceholder_-1854013440"/>
+          </w:placeholder>
+        </w:sdtPr>
+        <w:sdtContent>
+          <w:r>
+            <w:rPr>
+              <w:color w:val="000000"/>
+              <w:lang w:val="en-GB"/>
+            </w:rPr>
+            <w:t>(1)</w:t>
+          </w:r>
+        </w:sdtContent>
+      </w:sdt>
+      <w:r>
+        <w:rPr>
+          <w:color w:val="000000"/>
+          <w:lang w:val="en-GB"/>
+        </w:rPr>
+        <w:t xml:space="preserve">. </w:t>
+      </w:r>
+      <w:r>
+        <w:rPr>
+          <w:color w:val="000000"/>
+          <w:lang w:val="en-GB"/>
+        </w:rPr>
+        <w:t xml:space="preserve">Since the first reported outbreak in Tanzania in 1952, the virus has spread globally causing a substantial morbidity and socioeconomic burden </w:t>
+      </w:r>
+      <w:sdt>
+        <w:sdtPr>
+          <w:rPr>
+            <w:color w:val="000000"/>
+            <w:lang w:val="en-GB"/>
+          </w:rPr>
+          <w:tag w:val="MENDELEY_CITATION_v3_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"/>
+          <w:id w:val="-407464491"/>
+          <w:placeholder>
+            <w:docPart w:val="DefaultPlaceholder_-1854013440"/>
+          </w:placeholder>
+        </w:sdtPr>
+        <w:sdtContent>
+          <w:r>
+            <w:rPr>
+              <w:color w:val="000000"/>
+              <w:lang w:val="en-GB"/>
+            </w:rPr>
+            <w:t>(1)</w:t>
+          </w:r>
+        </w:sdtContent>
+      </w:sdt>
+      <w:r>
+        <w:rPr>
+          <w:color w:val="000000"/>
+          <w:lang w:val="en-GB"/>
+        </w:rPr>
+        <w:t>. The WHO report of 2022 indicate that the virus has spread to more that 110 countries making it</w:t>
+      </w:r>
+      <w:r>
+        <w:rPr>
+          <w:color w:val="000000"/>
+          <w:lang w:val="en-GB"/>
+        </w:rPr>
+        <w:t xml:space="preserve"> a major global health problem. </w:t>
+      </w:r>
+      <w:r>
+        <w:rPr>
+          <w:color w:val="000000"/>
+          <w:lang w:val="en-GB"/>
+        </w:rPr>
+        <w:t xml:space="preserve">The virus belongs to the family Togaviridae, genus alphavirus.  </w:t>
+      </w:r>
+      <w:r>
+        <w:rPr>
+          <w:color w:val="000000"/>
+          <w:lang w:val="en-GB"/>
+        </w:rPr>
+        <w:t>The virus is transmitted primarily by Aedes aegypti and Aedes Albopictus mosquitoes</w:t>
+      </w:r>
+      <w:r>
+        <w:rPr>
+          <w:color w:val="000000"/>
+          <w:lang w:val="en-GB"/>
+        </w:rPr>
+        <w:t xml:space="preserve"> </w:t>
+      </w:r>
+      <w:sdt>
+        <w:sdtPr>
+          <w:rPr>
+            <w:color w:val="000000"/>
+            <w:lang w:val="en-GB"/>
+          </w:rPr>
+          <w:tag w:val="MENDELEY_CITATION_v3_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"/>
+          <w:id w:val="944805428"/>
+          <w:placeholder>
+            <w:docPart w:val="DefaultPlaceholder_-1854013440"/>
+          </w:placeholder>
+        </w:sdtPr>
+        <w:sdtContent>
+          <w:r>
+            <w:rPr>
+              <w:color w:val="000000"/>
+              <w:lang w:val="en-GB"/>
+            </w:rPr>
+            <w:t>(2)</w:t>
+          </w:r>
+        </w:sdtContent>
+      </w:sdt>
+      <w:r>
+        <w:rPr>
+          <w:color w:val="000000"/>
+          <w:lang w:val="en-GB"/>
+        </w:rPr>
+        <w:t>.</w:t>
+      </w:r>
+      <w:r>
+        <w:rPr>
+          <w:color w:val="000000"/>
+          <w:lang w:val="en-GB"/>
+        </w:rPr>
+        <w:t xml:space="preserve"> Chikungunya virus is widespread throughout the tropic where it causes recurrent outbreaks of chikungunya fever </w:t>
+      </w:r>
+      <w:sdt>
+        <w:sdtPr>
+          <w:rPr>
+            <w:color w:val="000000"/>
+            <w:lang w:val="en-GB"/>
+          </w:rPr>
+          <w:tag w:val="MENDELEY_CITATION_v3_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"/>
+          <w:id w:val="-1109893974"/>
+          <w:placeholder>
+            <w:docPart w:val="DefaultPlaceholder_-1854013440"/>
+          </w:placeholder>
+        </w:sdtPr>
+        <w:sdtContent>
+          <w:r>
+            <w:rPr>
+              <w:color w:val="000000"/>
+              <w:lang w:val="en-GB"/>
+            </w:rPr>
+            <w:t>(2)</w:t>
+          </w:r>
+        </w:sdtContent>
+      </w:sdt>
+      <w:r>
+        <w:rPr>
+          <w:color w:val="000000"/>
+          <w:lang w:val="en-GB"/>
+        </w:rPr>
+        <w:t>. The effects of climate change as well as increased globalization of commerce and travel have led to the growth of habitat of aedes mosquitoes.</w:t>
+      </w:r>
+    </w:p>
+    <w:p>
+      <w:pPr>
+        <w:rPr>
+          <w:lang w:val="en-GB"/>
+        </w:rPr>
+      </w:pPr>
+    </w:p>
+    <w:p>
+      <w:pPr>
+        <w:rPr>
+          <w:lang w:val="en-GB"/>
+        </w:rPr>
+      </w:pPr>
+    </w:p>
+    <w:p>
+      <w:pPr>
+        <w:rPr>
+          <w:lang w:val="en-GB"/>
+        </w:rPr>
+      </w:pPr>
+    </w:p>
+    <w:p>
+      <w:pPr>
+        <w:rPr>
+          <w:lang w:val="en-GB"/>
+        </w:rPr>
+      </w:pPr>
+    </w:p>
+    <w:p>
+      <w:pPr>
+        <w:rPr>
+          <w:lang w:val="en-GB"/>
+        </w:rPr>
+      </w:pPr>
+    </w:p>
+    <w:p>
+      <w:pPr>
+        <w:rPr>
+          <w:lang w:val="en-GB"/>
+        </w:rPr>
+      </w:pPr>
+    </w:p>
+    <w:p>
+      <w:pPr>
+        <w:rPr>
+          <w:lang w:val="en-GB"/>
+        </w:rPr>
+      </w:pPr>
+    </w:p>
+    <w:p>
+      <w:pPr>
+        <w:rPr>
+          <w:lang w:val="en-GB"/>
+        </w:rPr>
+      </w:pPr>
+    </w:p>
+    <w:p>
+      <w:pPr>
+        <w:rPr>
+          <w:lang w:val="en-GB"/>
+        </w:rPr>
+      </w:pPr>
+    </w:p>
+    <w:p>
+      <w:pPr>
+        <w:rPr>
+          <w:lang w:val="en-GB"/>
+        </w:rPr>
+      </w:pPr>
+    </w:p>
+    <w:p>
+      <w:pPr>
+        <w:rPr>
+          <w:lang w:val="en-GB"/>
+        </w:rPr>
+      </w:pPr>
+    </w:p>
+    <w:p>
+      <w:pPr>
+        <w:rPr>
+          <w:lang w:val="en-GB"/>
+        </w:rPr>
+      </w:pPr>
+    </w:p>
+    <w:p>
+      <w:pPr>
+        <w:rPr>
+          <w:lang w:val="en-GB"/>
+        </w:rPr>
+      </w:pPr>
+    </w:p>
+    <w:p>
+      <w:pPr>
+        <w:rPr>
+          <w:lang w:val="en-GB"/>
+        </w:rPr>
+      </w:pPr>
+    </w:p>
+    <w:p>
+      <w:pPr>
+        <w:rPr>
+          <w:lang w:val="en-GB"/>
+        </w:rPr>
+      </w:pPr>
+    </w:p>
+    <w:p>
+      <w:pPr>
+        <w:rPr>
+          <w:lang w:val="en-GB"/>
+        </w:rPr>
+      </w:pPr>
+    </w:p>
+    <w:p>
+      <w:pPr>
+        <w:rPr>
+          <w:lang w:val="en-GB"/>
+        </w:rPr>
+      </w:pPr>
+    </w:p>
+    <w:p>
+      <w:pPr>
+        <w:rPr>
+          <w:lang w:val="en-GB"/>
+        </w:rPr>
+      </w:pPr>
+    </w:p>
+    <w:p>
+      <w:pPr>
+        <w:rPr>
+          <w:lang w:val="en-GB"/>
+        </w:rPr>
+      </w:pPr>
+    </w:p>
+    <w:p>
+      <w:pPr>
+        <w:rPr>
+          <w:lang w:val="en-GB"/>
+        </w:rPr>
+      </w:pPr>
+    </w:p>
+    <w:p>
+      <w:pPr>
+        <w:rPr>
+          <w:lang w:val="en-GB"/>
+        </w:rPr>
+      </w:pPr>
+    </w:p>
+    <w:p>
+      <w:pPr>
+        <w:rPr>
+          <w:lang w:val="en-GB"/>
+        </w:rPr>
+      </w:pPr>
+    </w:p>
+    <w:p>
+      <w:pPr>
+        <w:rPr>
+          <w:lang w:val="en-GB"/>
+        </w:rPr>
+      </w:pPr>
+    </w:p>
+    <w:p>
+      <w:pPr>
+        <w:rPr>
+          <w:lang w:val="en-GB"/>
+        </w:rPr>
+      </w:pPr>
+    </w:p>
+    <w:p>
+      <w:pPr>
+        <w:rPr>
+          <w:lang w:val="en-GB"/>
+        </w:rPr>
+      </w:pPr>
+      <w:r>
+        <w:rPr>
+          <w:lang w:val="en-GB"/>
+        </w:rPr>
+        <w:t>References</w:t>
+      </w:r>
+    </w:p>
+    <w:sdt>
+      <w:sdtPr>
+        <w:rPr>
+          <w:color w:val="000000"/>
+          <w:lang w:val="en-GB"/>
+        </w:rPr>
+        <w:tag w:val="MENDELEY_BIBLIOGRAPHY"/>
+        <w:id w:val="1807046537"/>
+        <w:placeholder>
+          <w:docPart w:val="DefaultPlaceholder_-1854013440"/>
+        </w:placeholder>
+      </w:sdtPr>
+      <w:sdtEndPr>
+        <w:rPr>
+          <w:color w:val="auto"/>
+        </w:rPr>
+      </w:sdtEndPr>
+      <w:sdtContent>
+        <w:p>
+          <w:pPr>
+            <w:autoSpaceDE w:val="0"/>
+            <w:autoSpaceDN w:val="0"/>
+            <w:ind w:hanging="640"/>
+            <w:divId w:val="1628312234"/>
+            <w:rPr>
+              <w:rFonts w:eastAsia="Times New Roman"/>
+              <w:kern w:val="0"/>
+              <w14:ligatures w14:val="none"/>
+            </w:rPr>
+          </w:pPr>
+          <w:r>
+            <w:rPr>
+              <w:rFonts w:eastAsia="Times New Roman"/>
+            </w:rPr>
+            <w:t>1.</w:t>
+          </w:r>
+          <w:r>
+            <w:rPr>
+              <w:rFonts w:eastAsia="Times New Roman"/>
+            </w:rPr>
+            <w:tab/>
+            <w:t xml:space="preserve">De Roo AM, </w:t>
+          </w:r>
+          <w:proofErr w:type="spellStart"/>
+          <w:r>
+            <w:rPr>
+              <w:rFonts w:eastAsia="Times New Roman"/>
+            </w:rPr>
+            <w:t>Vondeling</w:t>
+          </w:r>
+          <w:proofErr w:type="spellEnd"/>
+          <w:r>
+            <w:rPr>
+              <w:rFonts w:eastAsia="Times New Roman"/>
+            </w:rPr>
+            <w:t xml:space="preserve"> GT, Boer M, Murray K, Postma MJ. The global health and economic burden of chikungunya from 2011 to 2020: a model-driven analysis on the impact of an emerging vector-borne disease. BMJ Glob Health [Internet]. 2024 Dec 3 [cited 2025 Jul 29];9(12). Available from: https://gh.bmj.com/content/9/12/e016648</w:t>
+          </w:r>
+        </w:p>
+        <w:p>
+          <w:pPr>
+            <w:autoSpaceDE w:val="0"/>
+            <w:autoSpaceDN w:val="0"/>
+            <w:ind w:hanging="640"/>
+            <w:divId w:val="582950918"/>
+            <w:rPr>
+              <w:rFonts w:eastAsia="Times New Roman"/>
+            </w:rPr>
+          </w:pPr>
+          <w:r>
+            <w:rPr>
+              <w:rFonts w:eastAsia="Times New Roman"/>
+              <w:lang w:val="de-DE"/>
+            </w:rPr>
+            <w:t>2.</w:t>
+          </w:r>
+          <w:r>
+            <w:rPr>
+              <w:rFonts w:eastAsia="Times New Roman"/>
+              <w:lang w:val="de-DE"/>
+            </w:rPr>
+            <w:tab/>
+          </w:r>
+          <w:proofErr w:type="spellStart"/>
+          <w:r>
+            <w:rPr>
+              <w:rFonts w:eastAsia="Times New Roman"/>
+              <w:lang w:val="de-DE"/>
+            </w:rPr>
+            <w:t>Bartholomeeusen</w:t>
+          </w:r>
+          <w:proofErr w:type="spellEnd"/>
+          <w:r>
+            <w:rPr>
+              <w:rFonts w:eastAsia="Times New Roman"/>
+              <w:lang w:val="de-DE"/>
+            </w:rPr>
+            <w:t xml:space="preserve"> K, Daniel M, </w:t>
+          </w:r>
+          <w:proofErr w:type="spellStart"/>
+          <w:r>
+            <w:rPr>
+              <w:rFonts w:eastAsia="Times New Roman"/>
+              <w:lang w:val="de-DE"/>
+            </w:rPr>
+            <w:t>LaBeaud</w:t>
+          </w:r>
+          <w:proofErr w:type="spellEnd"/>
+          <w:r>
+            <w:rPr>
+              <w:rFonts w:eastAsia="Times New Roman"/>
+              <w:lang w:val="de-DE"/>
+            </w:rPr>
+            <w:t xml:space="preserve"> DA, </w:t>
+          </w:r>
+          <w:proofErr w:type="spellStart"/>
+          <w:r>
+            <w:rPr>
+              <w:rFonts w:eastAsia="Times New Roman"/>
+              <w:lang w:val="de-DE"/>
+            </w:rPr>
+            <w:t>Gasque</w:t>
+          </w:r>
+          <w:proofErr w:type="spellEnd"/>
+          <w:r>
+            <w:rPr>
+              <w:rFonts w:eastAsia="Times New Roman"/>
+              <w:lang w:val="de-DE"/>
+            </w:rPr>
+            <w:t xml:space="preserve"> P, Peeling RW, Stephenson KE, et al. </w:t>
+          </w:r>
+          <w:r>
+            <w:rPr>
+              <w:rFonts w:eastAsia="Times New Roman"/>
+            </w:rPr>
+            <w:t>Chikungunya fever. Nature Reviews Disease Primers 2023 9:1 [Internet]. 2023 Apr 6 [cited 2025 Jul 29];9(1):1–21. Available from: https://www.nature.com/articles/s41572-023-00429-2</w:t>
+          </w:r>
+        </w:p>
+        <w:p>
+          <w:pPr>
+            <w:autoSpaceDE w:val="0"/>
+            <w:autoSpaceDN w:val="0"/>
+            <w:ind w:left="640" w:hanging="640"/>
+            <w:divId w:val="1259094859"/>
+            <w:rPr>
+              <w:rFonts w:eastAsia="Times New Roman"/>
+              <w:color w:val="000000"/>
+              <w:kern w:val="0"/>
+              <w14:ligatures w14:val="none"/>
+            </w:rPr>
+          </w:pPr>
+          <w:r>
+            <w:rPr>
+              <w:rFonts w:eastAsia="Times New Roman"/>
+            </w:rPr>
+            <w:t> </w:t>
+          </w:r>
+        </w:p>
+      </w:sdtContent>
+    </w:sdt>
     <w:sectPr>
       <w:pgSz w:w="12240" w:h="15840"/>
       <w:pgMar w:top="1440" w:right="1440" w:bottom="1440" w:left="1440" w:header="720" w:footer="720" w:gutter="0"/>
@@ -11,6 +552,103 @@
     </w:sectPr>
   </w:body>
 </w:document>
+</file>
+
+<file path=word/numbering.xml><?xml version="1.0" encoding="utf-8"?>
+<w:numbering xmlns:wpc="http://schemas.microsoft.com/office/word/2010/wordprocessingCanvas" xmlns:cx="http://schemas.microsoft.com/office/drawing/2014/chartex" xmlns:cx1="http://schemas.microsoft.com/office/drawing/2015/9/8/chartex" xmlns:cx2="http://schemas.microsoft.com/office/drawing/2015/10/21/chartex" xmlns:cx3="http://schemas.microsoft.com/office/drawing/2016/5/9/chartex" xmlns:cx4="http://schemas.microsoft.com/office/drawing/2016/5/10/chartex" xmlns:cx5="http://schemas.microsoft.com/office/drawing/2016/5/11/chartex" xmlns:cx6="http://schemas.microsoft.com/office/drawing/2016/5/12/chartex" xmlns:cx7="http://schemas.microsoft.com/office/drawing/2016/5/13/chartex" xmlns:cx8="http://schemas.microsoft.com/office/drawing/2016/5/14/chartex" xmlns:mc="http://schemas.openxmlformats.org/markup-compatibility/2006" xmlns:aink="http://schemas.microsoft.com/office/drawing/2016/ink" xmlns:am3d="http://schemas.microsoft.com/office/drawing/2017/model3d" xmlns:o="urn:schemas-microsoft-com:office:office" xmlns:oel="http://schemas.microsoft.com/office/2019/extlst" xmlns:r="http://schemas.openxmlformats.org/officeDocument/2006/relationships" xmlns:m="http://schemas.openxmlformats.org/officeDocument/2006/math" xmlns:v="urn:schemas-microsoft-com:vml" xmlns:wp14="http://schemas.microsoft.com/office/word/2010/wordprocessingDrawing" xmlns:wp="http://schemas.openxmlformats.org/drawingml/2006/wordprocessingDrawing" xmlns:w10="urn:schemas-microsoft-com:office:word" xmlns:w="http://schemas.openxmlformats.org/wordprocessingml/2006/main" xmlns:w14="http://schemas.microsoft.com/office/word/2010/wordml" xmlns:w15="http://schemas.microsoft.com/office/word/2012/wordml" xmlns:w16cex="http://schemas.microsoft.com/office/word/2018/wordml/cex" xmlns:w16cid="http://schemas.microsoft.com/office/word/2016/wordml/cid" xmlns:w16="http://schemas.microsoft.com/office/word/2018/wordml" xmlns:w16du="http://schemas.microsoft.com/office/word/2023/wordml/word16du" xmlns:w16sdtdh="http://schemas.microsoft.com/office/word/2020/wordml/sdtdatahash" xmlns:w16sdtfl="http://schemas.microsoft.com/office/word/2024/wordml/sdtformatlock" xmlns:w16se="http://schemas.microsoft.com/office/word/2015/wordml/symex" xmlns:wpg="http://schemas.microsoft.com/office/word/2010/wordprocessingGroup" xmlns:wpi="http://schemas.microsoft.com/office/word/2010/wordprocessingInk" xmlns:wne="http://schemas.microsoft.com/office/word/2006/wordml" xmlns:wps="http://schemas.microsoft.com/office/word/2010/wordprocessingShape" mc:Ignorable="w14 w15 w16se w16cid w16 w16cex w16sdtdh w16sdtfl w16du wp14">
+  <w:abstractNum w:abstractNumId="0" w15:restartNumberingAfterBreak="0">
+    <w:nsid w:val="271A4FD6"/>
+    <w:multiLevelType w:val="hybridMultilevel"/>
+    <w:tmpl w:val="EA00994C"/>
+    <w:lvl w:ilvl="0" w:tplc="0409000F">
+      <w:start w:val="1"/>
+      <w:numFmt w:val="decimal"/>
+      <w:lvlText w:val="%1."/>
+      <w:lvlJc w:val="left"/>
+      <w:pPr>
+        <w:ind w:left="720" w:hanging="360"/>
+      </w:pPr>
+      <w:rPr>
+        <w:rFonts w:hint="default"/>
+      </w:rPr>
+    </w:lvl>
+    <w:lvl w:ilvl="1" w:tplc="04090019" w:tentative="1">
+      <w:start w:val="1"/>
+      <w:numFmt w:val="lowerLetter"/>
+      <w:lvlText w:val="%2."/>
+      <w:lvlJc w:val="left"/>
+      <w:pPr>
+        <w:ind w:left="1440" w:hanging="360"/>
+      </w:pPr>
+    </w:lvl>
+    <w:lvl w:ilvl="2" w:tplc="0409001B" w:tentative="1">
+      <w:start w:val="1"/>
+      <w:numFmt w:val="lowerRoman"/>
+      <w:lvlText w:val="%3."/>
+      <w:lvlJc w:val="right"/>
+      <w:pPr>
+        <w:ind w:left="2160" w:hanging="180"/>
+      </w:pPr>
+    </w:lvl>
+    <w:lvl w:ilvl="3" w:tplc="0409000F" w:tentative="1">
+      <w:start w:val="1"/>
+      <w:numFmt w:val="decimal"/>
+      <w:lvlText w:val="%4."/>
+      <w:lvlJc w:val="left"/>
+      <w:pPr>
+        <w:ind w:left="2880" w:hanging="360"/>
+      </w:pPr>
+    </w:lvl>
+    <w:lvl w:ilvl="4" w:tplc="04090019" w:tentative="1">
+      <w:start w:val="1"/>
+      <w:numFmt w:val="lowerLetter"/>
+      <w:lvlText w:val="%5."/>
+      <w:lvlJc w:val="left"/>
+      <w:pPr>
+        <w:ind w:left="3600" w:hanging="360"/>
+      </w:pPr>
+    </w:lvl>
+    <w:lvl w:ilvl="5" w:tplc="0409001B" w:tentative="1">
+      <w:start w:val="1"/>
+      <w:numFmt w:val="lowerRoman"/>
+      <w:lvlText w:val="%6."/>
+      <w:lvlJc w:val="right"/>
+      <w:pPr>
+        <w:ind w:left="4320" w:hanging="180"/>
+      </w:pPr>
+    </w:lvl>
+    <w:lvl w:ilvl="6" w:tplc="0409000F" w:tentative="1">
+      <w:start w:val="1"/>
+      <w:numFmt w:val="decimal"/>
+      <w:lvlText w:val="%7."/>
+      <w:lvlJc w:val="left"/>
+      <w:pPr>
+        <w:ind w:left="5040" w:hanging="360"/>
+      </w:pPr>
+    </w:lvl>
+    <w:lvl w:ilvl="7" w:tplc="04090019" w:tentative="1">
+      <w:start w:val="1"/>
+      <w:numFmt w:val="lowerLetter"/>
+      <w:lvlText w:val="%8."/>
+      <w:lvlJc w:val="left"/>
+      <w:pPr>
+        <w:ind w:left="5760" w:hanging="360"/>
+      </w:pPr>
+    </w:lvl>
+    <w:lvl w:ilvl="8" w:tplc="0409001B" w:tentative="1">
+      <w:start w:val="1"/>
+      <w:numFmt w:val="lowerRoman"/>
+      <w:lvlText w:val="%9."/>
+      <w:lvlJc w:val="right"/>
+      <w:pPr>
+        <w:ind w:left="6480" w:hanging="180"/>
+      </w:pPr>
+    </w:lvl>
+  </w:abstractNum>
+  <w:num w:numId="1" w16cid:durableId="468742634">
+    <w:abstractNumId w:val="0"/>
+  </w:num>
+</w:numbering>
 </file>
 
 <file path=word/styles.xml><?xml version="1.0" encoding="utf-8"?>
@@ -930,7 +1568,565 @@
       <w:spacing w:val="5"/>
     </w:rPr>
   </w:style>
+  <w:style w:type="character" w:styleId="PlaceholderText">
+    <w:name w:val="Placeholder Text"/>
+    <w:basedOn w:val="DefaultParagraphFont"/>
+    <w:uiPriority w:val="99"/>
+    <w:semiHidden/>
+    <w:rsid w:val="00A21666"/>
+    <w:rPr>
+      <w:color w:val="666666"/>
+    </w:rPr>
+  </w:style>
 </w:styles>
+</file>
+
+<file path=word/glossary/document.xml><?xml version="1.0" encoding="utf-8"?>
+<w:glossaryDocument xmlns:wpc="http://schemas.microsoft.com/office/word/2010/wordprocessingCanvas" xmlns:cx="http://schemas.microsoft.com/office/drawing/2014/chartex" xmlns:cx1="http://schemas.microsoft.com/office/drawing/2015/9/8/chartex" xmlns:cx2="http://schemas.microsoft.com/office/drawing/2015/10/21/chartex" xmlns:cx3="http://schemas.microsoft.com/office/drawing/2016/5/9/chartex" xmlns:cx4="http://schemas.microsoft.com/office/drawing/2016/5/10/chartex" xmlns:cx5="http://schemas.microsoft.com/office/drawing/2016/5/11/chartex" xmlns:cx6="http://schemas.microsoft.com/office/drawing/2016/5/12/chartex" xmlns:cx7="http://schemas.microsoft.com/office/drawing/2016/5/13/chartex" xmlns:cx8="http://schemas.microsoft.com/office/drawing/2016/5/14/chartex" xmlns:mc="http://schemas.openxmlformats.org/markup-compatibility/2006" xmlns:aink="http://schemas.microsoft.com/office/drawing/2016/ink" xmlns:am3d="http://schemas.microsoft.com/office/drawing/2017/model3d" xmlns:o="urn:schemas-microsoft-com:office:office" xmlns:oel="http://schemas.microsoft.com/office/2019/extlst" xmlns:r="http://schemas.openxmlformats.org/officeDocument/2006/relationships" xmlns:m="http://schemas.openxmlformats.org/officeDocument/2006/math" xmlns:v="urn:schemas-microsoft-com:vml" xmlns:wp14="http://schemas.microsoft.com/office/word/2010/wordprocessingDrawing" xmlns:wp="http://schemas.openxmlformats.org/drawingml/2006/wordprocessingDrawing" xmlns:w10="urn:schemas-microsoft-com:office:word" xmlns:w="http://schemas.openxmlformats.org/wordprocessingml/2006/main" xmlns:w14="http://schemas.microsoft.com/office/word/2010/wordml" xmlns:w15="http://schemas.microsoft.com/office/word/2012/wordml" xmlns:w16cex="http://schemas.microsoft.com/office/word/2018/wordml/cex" xmlns:w16cid="http://schemas.microsoft.com/office/word/2016/wordml/cid" xmlns:w16="http://schemas.microsoft.com/office/word/2018/wordml" xmlns:w16du="http://schemas.microsoft.com/office/word/2023/wordml/word16du" xmlns:w16sdtdh="http://schemas.microsoft.com/office/word/2020/wordml/sdtdatahash" xmlns:w16sdtfl="http://schemas.microsoft.com/office/word/2024/wordml/sdtformatlock" xmlns:w16se="http://schemas.microsoft.com/office/word/2015/wordml/symex" xmlns:wpg="http://schemas.microsoft.com/office/word/2010/wordprocessingGroup" xmlns:wpi="http://schemas.microsoft.com/office/word/2010/wordprocessingInk" xmlns:wne="http://schemas.microsoft.com/office/word/2006/wordml" xmlns:wps="http://schemas.microsoft.com/office/word/2010/wordprocessingShape" mc:Ignorable="w14 w15 w16se w16cid w16 w16cex w16sdtdh w16sdtfl w16du wp14">
+  <w:docParts>
+    <w:docPart>
+      <w:docPartPr>
+        <w:name w:val="DefaultPlaceholder_-1854013440"/>
+        <w:category>
+          <w:name w:val="General"/>
+          <w:gallery w:val="placeholder"/>
+        </w:category>
+        <w:types>
+          <w:type w:val="bbPlcHdr"/>
+        </w:types>
+        <w:behaviors>
+          <w:behavior w:val="content"/>
+        </w:behaviors>
+        <w:guid w:val="{6E7003CE-15FB-6143-9684-2060D8C982D4}"/>
+      </w:docPartPr>
+      <w:docPartBody>
+        <w:p>
+          <w:r>
+            <w:rPr>
+              <w:rStyle w:val="PlaceholderText"/>
+            </w:rPr>
+            <w:t>Click or tap here to enter text.</w:t>
+          </w:r>
+        </w:p>
+      </w:docPartBody>
+    </w:docPart>
+  </w:docParts>
+</w:glossaryDocument>
+</file>
+
+<file path=word/glossary/fontTable.xml><?xml version="1.0" encoding="utf-8"?>
+<w:fonts xmlns:mc="http://schemas.openxmlformats.org/markup-compatibility/2006" xmlns:r="http://schemas.openxmlformats.org/officeDocument/2006/relationships" xmlns:w="http://schemas.openxmlformats.org/wordprocessingml/2006/main" xmlns:w14="http://schemas.microsoft.com/office/word/2010/wordml" xmlns:w15="http://schemas.microsoft.com/office/word/2012/wordml" xmlns:w16cex="http://schemas.microsoft.com/office/word/2018/wordml/cex" xmlns:w16cid="http://schemas.microsoft.com/office/word/2016/wordml/cid" xmlns:w16="http://schemas.microsoft.com/office/word/2018/wordml" xmlns:w16du="http://schemas.microsoft.com/office/word/2023/wordml/word16du" xmlns:w16sdtdh="http://schemas.microsoft.com/office/word/2020/wordml/sdtdatahash" xmlns:w16sdtfl="http://schemas.microsoft.com/office/word/2024/wordml/sdtformatlock" xmlns:w16se="http://schemas.microsoft.com/office/word/2015/wordml/symex" mc:Ignorable="w14 w15 w16se w16cid w16 w16cex w16sdtdh w16sdtfl w16du">
+  <w:font w:name="Times New Roman">
+    <w:panose1 w:val="02020603050405020304"/>
+    <w:charset w:val="00"/>
+    <w:family w:val="roman"/>
+    <w:pitch w:val="variable"/>
+    <w:sig w:usb0="E0002EFF" w:usb1="C000785B" w:usb2="00000009" w:usb3="00000000" w:csb0="000001FF" w:csb1="00000000"/>
+  </w:font>
+  <w:font w:name="Aptos">
+    <w:panose1 w:val="020B0004020202020204"/>
+    <w:charset w:val="00"/>
+    <w:family w:val="swiss"/>
+    <w:pitch w:val="variable"/>
+    <w:sig w:usb0="20000287" w:usb1="00000003" w:usb2="00000000" w:usb3="00000000" w:csb0="0000019F" w:csb1="00000000"/>
+  </w:font>
+  <w:font w:name="Aptos Display">
+    <w:panose1 w:val="020B0004020202020204"/>
+    <w:charset w:val="00"/>
+    <w:family w:val="swiss"/>
+    <w:pitch w:val="variable"/>
+    <w:sig w:usb0="20000287" w:usb1="00000003" w:usb2="00000000" w:usb3="00000000" w:csb0="0000019F" w:csb1="00000000"/>
+  </w:font>
+</w:fonts>
+</file>
+
+<file path=word/glossary/settings.xml><?xml version="1.0" encoding="utf-8"?>
+<w:settings xmlns:mc="http://schemas.openxmlformats.org/markup-compatibility/2006" xmlns:o="urn:schemas-microsoft-com:office:office" xmlns:r="http://schemas.openxmlformats.org/officeDocument/2006/relationships" xmlns:m="http://schemas.openxmlformats.org/officeDocument/2006/math" xmlns:v="urn:schemas-microsoft-com:vml" xmlns:w10="urn:schemas-microsoft-com:office:word" xmlns:w="http://schemas.openxmlformats.org/wordprocessingml/2006/main" xmlns:w14="http://schemas.microsoft.com/office/word/2010/wordml" xmlns:w15="http://schemas.microsoft.com/office/word/2012/wordml" xmlns:w16cex="http://schemas.microsoft.com/office/word/2018/wordml/cex" xmlns:w16cid="http://schemas.microsoft.com/office/word/2016/wordml/cid" xmlns:w16="http://schemas.microsoft.com/office/word/2018/wordml" xmlns:w16du="http://schemas.microsoft.com/office/word/2023/wordml/word16du" xmlns:w16sdtdh="http://schemas.microsoft.com/office/word/2020/wordml/sdtdatahash" xmlns:w16sdtfl="http://schemas.microsoft.com/office/word/2024/wordml/sdtformatlock" xmlns:w16se="http://schemas.microsoft.com/office/word/2015/wordml/symex" xmlns:sl="http://schemas.openxmlformats.org/schemaLibrary/2006/main" mc:Ignorable="w14 w15 w16se w16cid w16 w16cex w16sdtdh w16sdtfl w16du">
+  <w:view w:val="normal"/>
+  <w:defaultTabStop w:val="720"/>
+  <w:characterSpacingControl w:val="doNotCompress"/>
+  <w:compat>
+    <w:useFELayout/>
+    <w:compatSetting w:name="compatibilityMode" w:uri="http://schemas.microsoft.com/office/word" w:val="15"/>
+    <w:compatSetting w:name="overrideTableStyleFontSizeAndJustification" w:uri="http://schemas.microsoft.com/office/word" w:val="1"/>
+    <w:compatSetting w:name="enableOpenTypeFeatures" w:uri="http://schemas.microsoft.com/office/word" w:val="1"/>
+    <w:compatSetting w:name="doNotFlipMirrorIndents" w:uri="http://schemas.microsoft.com/office/word" w:val="1"/>
+    <w:compatSetting w:name="differentiateMultirowTableHeaders" w:uri="http://schemas.microsoft.com/office/word" w:val="1"/>
+    <w:compatSetting w:name="useWord2013TrackBottomHyphenation" w:uri="http://schemas.microsoft.com/office/word" w:val="0"/>
+  </w:compat>
+  <w:rsids>
+    <w:rsidRoot w:val="00D82711"/>
+    <w:rsid w:val="00262150"/>
+    <w:rsid w:val="00332583"/>
+    <w:rsid w:val="00D82711"/>
+  </w:rsids>
+  <m:mathPr>
+    <m:mathFont m:val="Cambria Math"/>
+    <m:brkBin m:val="before"/>
+    <m:brkBinSub m:val="--"/>
+    <m:smallFrac m:val="0"/>
+    <m:dispDef/>
+    <m:lMargin m:val="0"/>
+    <m:rMargin m:val="0"/>
+    <m:defJc m:val="centerGroup"/>
+    <m:wrapIndent m:val="1440"/>
+    <m:intLim m:val="subSup"/>
+    <m:naryLim m:val="undOvr"/>
+  </m:mathPr>
+  <w:themeFontLang w:val="en-US"/>
+  <w:clrSchemeMapping w:bg1="light1" w:t1="dark1" w:bg2="light2" w:t2="dark2" w:accent1="accent1" w:accent2="accent2" w:accent3="accent3" w:accent4="accent4" w:accent5="accent5" w:accent6="accent6" w:hyperlink="hyperlink" w:followedHyperlink="followedHyperlink"/>
+  <w:decimalSymbol w:val="."/>
+  <w:listSeparator w:val=","/>
+  <w15:chartTrackingRefBased/>
+</w:settings>
+</file>
+
+<file path=word/glossary/styles.xml><?xml version="1.0" encoding="utf-8"?>
+<w:styles xmlns:mc="http://schemas.openxmlformats.org/markup-compatibility/2006" xmlns:r="http://schemas.openxmlformats.org/officeDocument/2006/relationships" xmlns:w="http://schemas.openxmlformats.org/wordprocessingml/2006/main" xmlns:w14="http://schemas.microsoft.com/office/word/2010/wordml" xmlns:w15="http://schemas.microsoft.com/office/word/2012/wordml" xmlns:w16cex="http://schemas.microsoft.com/office/word/2018/wordml/cex" xmlns:w16cid="http://schemas.microsoft.com/office/word/2016/wordml/cid" xmlns:w16="http://schemas.microsoft.com/office/word/2018/wordml" xmlns:w16du="http://schemas.microsoft.com/office/word/2023/wordml/word16du" xmlns:w16sdtdh="http://schemas.microsoft.com/office/word/2020/wordml/sdtdatahash" xmlns:w16sdtfl="http://schemas.microsoft.com/office/word/2024/wordml/sdtformatlock" xmlns:w16se="http://schemas.microsoft.com/office/word/2015/wordml/symex" mc:Ignorable="w14 w15 w16se w16cid w16 w16cex w16sdtdh w16sdtfl w16du">
+  <w:docDefaults>
+    <w:rPrDefault>
+      <w:rPr>
+        <w:rFonts w:asciiTheme="minorHAnsi" w:eastAsiaTheme="minorEastAsia" w:hAnsiTheme="minorHAnsi" w:cstheme="minorBidi"/>
+        <w:kern w:val="2"/>
+        <w:sz w:val="24"/>
+        <w:szCs w:val="24"/>
+        <w:lang w:val="en-US" w:eastAsia="en-US" w:bidi="ar-SA"/>
+        <w14:ligatures w14:val="standardContextual"/>
+      </w:rPr>
+    </w:rPrDefault>
+    <w:pPrDefault>
+      <w:pPr>
+        <w:spacing w:after="160" w:line="278" w:lineRule="auto"/>
+      </w:pPr>
+    </w:pPrDefault>
+  </w:docDefaults>
+  <w:latentStyles w:defLockedState="0" w:defUIPriority="99" w:defSemiHidden="0" w:defUnhideWhenUsed="0" w:defQFormat="0" w:count="376">
+    <w:lsdException w:name="Normal" w:uiPriority="0" w:qFormat="1"/>
+    <w:lsdException w:name="heading 1" w:uiPriority="9" w:qFormat="1"/>
+    <w:lsdException w:name="heading 2" w:semiHidden="1" w:uiPriority="9" w:unhideWhenUsed="1" w:qFormat="1"/>
+    <w:lsdException w:name="heading 3" w:semiHidden="1" w:uiPriority="9" w:unhideWhenUsed="1" w:qFormat="1"/>
+    <w:lsdException w:name="heading 4" w:semiHidden="1" w:uiPriority="9" w:unhideWhenUsed="1" w:qFormat="1"/>
+    <w:lsdException w:name="heading 5" w:semiHidden="1" w:uiPriority="9" w:unhideWhenUsed="1" w:qFormat="1"/>
+    <w:lsdException w:name="heading 6" w:semiHidden="1" w:uiPriority="9" w:unhideWhenUsed="1" w:qFormat="1"/>
+    <w:lsdException w:name="heading 7" w:semiHidden="1" w:uiPriority="9" w:unhideWhenUsed="1" w:qFormat="1"/>
+    <w:lsdException w:name="heading 8" w:semiHidden="1" w:uiPriority="9" w:unhideWhenUsed="1" w:qFormat="1"/>
+    <w:lsdException w:name="heading 9" w:semiHidden="1" w:uiPriority="9" w:unhideWhenUsed="1" w:qFormat="1"/>
+    <w:lsdException w:name="index 1" w:semiHidden="1" w:unhideWhenUsed="1"/>
+    <w:lsdException w:name="index 2" w:semiHidden="1" w:unhideWhenUsed="1"/>
+    <w:lsdException w:name="index 3" w:semiHidden="1" w:unhideWhenUsed="1"/>
+    <w:lsdException w:name="index 4" w:semiHidden="1" w:unhideWhenUsed="1"/>
+    <w:lsdException w:name="index 5" w:semiHidden="1" w:unhideWhenUsed="1"/>
+    <w:lsdException w:name="index 6" w:semiHidden="1" w:unhideWhenUsed="1"/>
+    <w:lsdException w:name="index 7" w:semiHidden="1" w:unhideWhenUsed="1"/>
+    <w:lsdException w:name="index 8" w:semiHidden="1" w:unhideWhenUsed="1"/>
+    <w:lsdException w:name="index 9" w:semiHidden="1" w:unhideWhenUsed="1"/>
+    <w:lsdException w:name="toc 1" w:semiHidden="1" w:uiPriority="39" w:unhideWhenUsed="1"/>
+    <w:lsdException w:name="toc 2" w:semiHidden="1" w:uiPriority="39" w:unhideWhenUsed="1"/>
+    <w:lsdException w:name="toc 3" w:semiHidden="1" w:uiPriority="39" w:unhideWhenUsed="1"/>
+    <w:lsdException w:name="toc 4" w:semiHidden="1" w:uiPriority="39" w:unhideWhenUsed="1"/>
+    <w:lsdException w:name="toc 5" w:semiHidden="1" w:uiPriority="39" w:unhideWhenUsed="1"/>
+    <w:lsdException w:name="toc 6" w:semiHidden="1" w:uiPriority="39" w:unhideWhenUsed="1"/>
+    <w:lsdException w:name="toc 7" w:semiHidden="1" w:uiPriority="39" w:unhideWhenUsed="1"/>
+    <w:lsdException w:name="toc 8" w:semiHidden="1" w:uiPriority="39" w:unhideWhenUsed="1"/>
+    <w:lsdException w:name="toc 9" w:semiHidden="1" w:uiPriority="39" w:unhideWhenUsed="1"/>
+    <w:lsdException w:name="Normal Indent" w:semiHidden="1" w:unhideWhenUsed="1"/>
+    <w:lsdException w:name="footnote text" w:semiHidden="1" w:unhideWhenUsed="1"/>
+    <w:lsdException w:name="annotation text" w:semiHidden="1" w:unhideWhenUsed="1"/>
+    <w:lsdException w:name="header" w:semiHidden="1" w:unhideWhenUsed="1"/>
+    <w:lsdException w:name="footer" w:semiHidden="1" w:unhideWhenUsed="1"/>
+    <w:lsdException w:name="index heading" w:semiHidden="1" w:unhideWhenUsed="1"/>
+    <w:lsdException w:name="caption" w:semiHidden="1" w:uiPriority="35" w:unhideWhenUsed="1" w:qFormat="1"/>
+    <w:lsdException w:name="table of figures" w:semiHidden="1" w:unhideWhenUsed="1"/>
+    <w:lsdException w:name="envelope address" w:semiHidden="1" w:unhideWhenUsed="1"/>
+    <w:lsdException w:name="envelope return" w:semiHidden="1" w:unhideWhenUsed="1"/>
+    <w:lsdException w:name="footnote reference" w:semiHidden="1" w:unhideWhenUsed="1"/>
+    <w:lsdException w:name="annotation reference" w:semiHidden="1" w:unhideWhenUsed="1"/>
+    <w:lsdException w:name="line number" w:semiHidden="1" w:unhideWhenUsed="1"/>
+    <w:lsdException w:name="page number" w:semiHidden="1" w:unhideWhenUsed="1"/>
+    <w:lsdException w:name="endnote reference" w:semiHidden="1" w:unhideWhenUsed="1"/>
+    <w:lsdException w:name="endnote text" w:semiHidden="1" w:unhideWhenUsed="1"/>
+    <w:lsdException w:name="table of authorities" w:semiHidden="1" w:unhideWhenUsed="1"/>
+    <w:lsdException w:name="macro" w:semiHidden="1" w:unhideWhenUsed="1"/>
+    <w:lsdException w:name="toa heading" w:semiHidden="1" w:unhideWhenUsed="1"/>
+    <w:lsdException w:name="List" w:semiHidden="1" w:unhideWhenUsed="1"/>
+    <w:lsdException w:name="List Bullet" w:semiHidden="1" w:unhideWhenUsed="1"/>
+    <w:lsdException w:name="List Number" w:semiHidden="1" w:unhideWhenUsed="1"/>
+    <w:lsdException w:name="List 2" w:semiHidden="1" w:unhideWhenUsed="1"/>
+    <w:lsdException w:name="List 3" w:semiHidden="1" w:unhideWhenUsed="1"/>
+    <w:lsdException w:name="List 4" w:semiHidden="1" w:unhideWhenUsed="1"/>
+    <w:lsdException w:name="List 5" w:semiHidden="1" w:unhideWhenUsed="1"/>
+    <w:lsdException w:name="List Bullet 2" w:semiHidden="1" w:unhideWhenUsed="1"/>
+    <w:lsdException w:name="List Bullet 3" w:semiHidden="1" w:unhideWhenUsed="1"/>
+    <w:lsdException w:name="List Bullet 4" w:semiHidden="1" w:unhideWhenUsed="1"/>
+    <w:lsdException w:name="List Bullet 5" w:semiHidden="1" w:unhideWhenUsed="1"/>
+    <w:lsdException w:name="List Number 2" w:semiHidden="1" w:unhideWhenUsed="1"/>
+    <w:lsdException w:name="List Number 3" w:semiHidden="1" w:unhideWhenUsed="1"/>
+    <w:lsdException w:name="List Number 4" w:semiHidden="1" w:unhideWhenUsed="1"/>
+    <w:lsdException w:name="List Number 5" w:semiHidden="1" w:unhideWhenUsed="1"/>
+    <w:lsdException w:name="Title" w:uiPriority="10" w:qFormat="1"/>
+    <w:lsdException w:name="Closing" w:semiHidden="1" w:unhideWhenUsed="1"/>
+    <w:lsdException w:name="Signature" w:semiHidden="1" w:unhideWhenUsed="1"/>
+    <w:lsdException w:name="Default Paragraph Font" w:semiHidden="1" w:uiPriority="1" w:unhideWhenUsed="1"/>
+    <w:lsdException w:name="Body Text" w:semiHidden="1" w:unhideWhenUsed="1"/>
+    <w:lsdException w:name="Body Text Indent" w:semiHidden="1" w:unhideWhenUsed="1"/>
+    <w:lsdException w:name="List Continue" w:semiHidden="1" w:unhideWhenUsed="1"/>
+    <w:lsdException w:name="List Continue 2" w:semiHidden="1" w:unhideWhenUsed="1"/>
+    <w:lsdException w:name="List Continue 3" w:semiHidden="1" w:unhideWhenUsed="1"/>
+    <w:lsdException w:name="List Continue 4" w:semiHidden="1" w:unhideWhenUsed="1"/>
+    <w:lsdException w:name="List Continue 5" w:semiHidden="1" w:unhideWhenUsed="1"/>
+    <w:lsdException w:name="Message Header" w:semiHidden="1" w:unhideWhenUsed="1"/>
+    <w:lsdException w:name="Subtitle" w:uiPriority="11" w:qFormat="1"/>
+    <w:lsdException w:name="Salutation" w:semiHidden="1" w:unhideWhenUsed="1"/>
+    <w:lsdException w:name="Date" w:semiHidden="1" w:unhideWhenUsed="1"/>
+    <w:lsdException w:name="Body Text First Indent" w:semiHidden="1" w:unhideWhenUsed="1"/>
+    <w:lsdException w:name="Body Text First Indent 2" w:semiHidden="1" w:unhideWhenUsed="1"/>
+    <w:lsdException w:name="Note Heading" w:semiHidden="1" w:unhideWhenUsed="1"/>
+    <w:lsdException w:name="Body Text 2" w:semiHidden="1" w:unhideWhenUsed="1"/>
+    <w:lsdException w:name="Body Text 3" w:semiHidden="1" w:unhideWhenUsed="1"/>
+    <w:lsdException w:name="Body Text Indent 2" w:semiHidden="1" w:unhideWhenUsed="1"/>
+    <w:lsdException w:name="Body Text Indent 3" w:semiHidden="1" w:unhideWhenUsed="1"/>
+    <w:lsdException w:name="Block Text" w:semiHidden="1" w:unhideWhenUsed="1"/>
+    <w:lsdException w:name="Hyperlink" w:semiHidden="1" w:unhideWhenUsed="1"/>
+    <w:lsdException w:name="FollowedHyperlink" w:semiHidden="1" w:unhideWhenUsed="1"/>
+    <w:lsdException w:name="Strong" w:uiPriority="22" w:qFormat="1"/>
+    <w:lsdException w:name="Emphasis" w:uiPriority="20" w:qFormat="1"/>
+    <w:lsdException w:name="Document Map" w:semiHidden="1" w:unhideWhenUsed="1"/>
+    <w:lsdException w:name="Plain Text" w:semiHidden="1" w:unhideWhenUsed="1"/>
+    <w:lsdException w:name="E-mail Signature" w:semiHidden="1" w:unhideWhenUsed="1"/>
+    <w:lsdException w:name="HTML Top of Form" w:semiHidden="1" w:unhideWhenUsed="1"/>
+    <w:lsdException w:name="HTML Bottom of Form" w:semiHidden="1" w:unhideWhenUsed="1"/>
+    <w:lsdException w:name="Normal (Web)" w:semiHidden="1" w:unhideWhenUsed="1"/>
+    <w:lsdException w:name="HTML Acronym" w:semiHidden="1" w:unhideWhenUsed="1"/>
+    <w:lsdException w:name="HTML Address" w:semiHidden="1" w:unhideWhenUsed="1"/>
+    <w:lsdException w:name="HTML Cite" w:semiHidden="1" w:unhideWhenUsed="1"/>
+    <w:lsdException w:name="HTML Code" w:semiHidden="1" w:unhideWhenUsed="1"/>
+    <w:lsdException w:name="HTML Definition" w:semiHidden="1" w:unhideWhenUsed="1"/>
+    <w:lsdException w:name="HTML Keyboard" w:semiHidden="1" w:unhideWhenUsed="1"/>
+    <w:lsdException w:name="HTML Preformatted" w:semiHidden="1" w:unhideWhenUsed="1"/>
+    <w:lsdException w:name="HTML Sample" w:semiHidden="1" w:unhideWhenUsed="1"/>
+    <w:lsdException w:name="HTML Typewriter" w:semiHidden="1" w:unhideWhenUsed="1"/>
+    <w:lsdException w:name="HTML Variable" w:semiHidden="1" w:unhideWhenUsed="1"/>
+    <w:lsdException w:name="Normal Table" w:semiHidden="1" w:unhideWhenUsed="1"/>
+    <w:lsdException w:name="annotation subject" w:semiHidden="1" w:unhideWhenUsed="1"/>
+    <w:lsdException w:name="No List" w:semiHidden="1" w:unhideWhenUsed="1"/>
+    <w:lsdException w:name="Outline List 1" w:semiHidden="1" w:unhideWhenUsed="1"/>
+    <w:lsdException w:name="Outline List 2" w:semiHidden="1" w:unhideWhenUsed="1"/>
+    <w:lsdException w:name="Outline List 3" w:semiHidden="1" w:unhideWhenUsed="1"/>
+    <w:lsdException w:name="Table Simple 1" w:semiHidden="1" w:unhideWhenUsed="1"/>
+    <w:lsdException w:name="Table Simple 2" w:semiHidden="1" w:unhideWhenUsed="1"/>
+    <w:lsdException w:name="Table Simple 3" w:semiHidden="1" w:unhideWhenUsed="1"/>
+    <w:lsdException w:name="Table Classic 1" w:semiHidden="1" w:unhideWhenUsed="1"/>
+    <w:lsdException w:name="Table Classic 2" w:semiHidden="1" w:unhideWhenUsed="1"/>
+    <w:lsdException w:name="Table Classic 3" w:semiHidden="1" w:unhideWhenUsed="1"/>
+    <w:lsdException w:name="Table Classic 4" w:semiHidden="1" w:unhideWhenUsed="1"/>
+    <w:lsdException w:name="Table Colorful 1" w:semiHidden="1" w:unhideWhenUsed="1"/>
+    <w:lsdException w:name="Table Colorful 2" w:semiHidden="1" w:unhideWhenUsed="1"/>
+    <w:lsdException w:name="Table Colorful 3" w:semiHidden="1" w:unhideWhenUsed="1"/>
+    <w:lsdException w:name="Table Columns 1" w:semiHidden="1" w:unhideWhenUsed="1"/>
+    <w:lsdException w:name="Table Columns 2" w:semiHidden="1" w:unhideWhenUsed="1"/>
+    <w:lsdException w:name="Table Columns 3" w:semiHidden="1" w:unhideWhenUsed="1"/>
+    <w:lsdException w:name="Table Columns 4" w:semiHidden="1" w:unhideWhenUsed="1"/>
+    <w:lsdException w:name="Table Columns 5" w:semiHidden="1" w:unhideWhenUsed="1"/>
+    <w:lsdException w:name="Table Grid 1" w:semiHidden="1" w:unhideWhenUsed="1"/>
+    <w:lsdException w:name="Table Grid 2" w:semiHidden="1" w:unhideWhenUsed="1"/>
+    <w:lsdException w:name="Table Grid 3" w:semiHidden="1" w:unhideWhenUsed="1"/>
+    <w:lsdException w:name="Table Grid 4" w:semiHidden="1" w:unhideWhenUsed="1"/>
+    <w:lsdException w:name="Table Grid 5" w:semiHidden="1" w:unhideWhenUsed="1"/>
+    <w:lsdException w:name="Table Grid 6" w:semiHidden="1" w:unhideWhenUsed="1"/>
+    <w:lsdException w:name="Table Grid 7" w:semiHidden="1" w:unhideWhenUsed="1"/>
+    <w:lsdException w:name="Table Grid 8" w:semiHidden="1" w:unhideWhenUsed="1"/>
+    <w:lsdException w:name="Table List 1" w:semiHidden="1" w:unhideWhenUsed="1"/>
+    <w:lsdException w:name="Table List 2" w:semiHidden="1" w:unhideWhenUsed="1"/>
+    <w:lsdException w:name="Table List 3" w:semiHidden="1" w:unhideWhenUsed="1"/>
+    <w:lsdException w:name="Table List 4" w:semiHidden="1" w:unhideWhenUsed="1"/>
+    <w:lsdException w:name="Table List 5" w:semiHidden="1" w:unhideWhenUsed="1"/>
+    <w:lsdException w:name="Table List 6" w:semiHidden="1" w:unhideWhenUsed="1"/>
+    <w:lsdException w:name="Table List 7" w:semiHidden="1" w:unhideWhenUsed="1"/>
+    <w:lsdException w:name="Table List 8" w:semiHidden="1" w:unhideWhenUsed="1"/>
+    <w:lsdException w:name="Table 3D effects 1" w:semiHidden="1" w:unhideWhenUsed="1"/>
+    <w:lsdException w:name="Table 3D effects 2" w:semiHidden="1" w:unhideWhenUsed="1"/>
+    <w:lsdException w:name="Table 3D effects 3" w:semiHidden="1" w:unhideWhenUsed="1"/>
+    <w:lsdException w:name="Table Contemporary" w:semiHidden="1" w:unhideWhenUsed="1"/>
+    <w:lsdException w:name="Table Elegant" w:semiHidden="1" w:unhideWhenUsed="1"/>
+    <w:lsdException w:name="Table Professional" w:semiHidden="1" w:unhideWhenUsed="1"/>
+    <w:lsdException w:name="Table Subtle 1" w:semiHidden="1" w:unhideWhenUsed="1"/>
+    <w:lsdException w:name="Table Subtle 2" w:semiHidden="1" w:unhideWhenUsed="1"/>
+    <w:lsdException w:name="Table Web 1" w:semiHidden="1" w:unhideWhenUsed="1"/>
+    <w:lsdException w:name="Table Web 2" w:semiHidden="1" w:unhideWhenUsed="1"/>
+    <w:lsdException w:name="Table Web 3" w:semiHidden="1" w:unhideWhenUsed="1"/>
+    <w:lsdException w:name="Balloon Text" w:semiHidden="1" w:unhideWhenUsed="1"/>
+    <w:lsdException w:name="Table Grid" w:uiPriority="39"/>
+    <w:lsdException w:name="Table Theme" w:semiHidden="1" w:unhideWhenUsed="1"/>
+    <w:lsdException w:name="Placeholder Text" w:semiHidden="1"/>
+    <w:lsdException w:name="No Spacing" w:uiPriority="1" w:qFormat="1"/>
+    <w:lsdException w:name="Light Shading" w:uiPriority="60"/>
+    <w:lsdException w:name="Light List" w:uiPriority="61"/>
+    <w:lsdException w:name="Light Grid" w:uiPriority="62"/>
+    <w:lsdException w:name="Medium Shading 1" w:uiPriority="63"/>
+    <w:lsdException w:name="Medium Shading 2" w:uiPriority="64"/>
+    <w:lsdException w:name="Medium List 1" w:uiPriority="65"/>
+    <w:lsdException w:name="Medium List 2" w:uiPriority="66"/>
+    <w:lsdException w:name="Medium Grid 1" w:uiPriority="67"/>
+    <w:lsdException w:name="Medium Grid 2" w:uiPriority="68"/>
+    <w:lsdException w:name="Medium Grid 3" w:uiPriority="69"/>
+    <w:lsdException w:name="Dark List" w:uiPriority="70"/>
+    <w:lsdException w:name="Colorful Shading" w:uiPriority="71"/>
+    <w:lsdException w:name="Colorful List" w:uiPriority="72"/>
+    <w:lsdException w:name="Colorful Grid" w:uiPriority="73"/>
+    <w:lsdException w:name="Light Shading Accent 1" w:uiPriority="60"/>
+    <w:lsdException w:name="Light List Accent 1" w:uiPriority="61"/>
+    <w:lsdException w:name="Light Grid Accent 1" w:uiPriority="62"/>
+    <w:lsdException w:name="Medium Shading 1 Accent 1" w:uiPriority="63"/>
+    <w:lsdException w:name="Medium Shading 2 Accent 1" w:uiPriority="64"/>
+    <w:lsdException w:name="Medium List 1 Accent 1" w:uiPriority="65"/>
+    <w:lsdException w:name="Revision" w:semiHidden="1"/>
+    <w:lsdException w:name="List Paragraph" w:uiPriority="34" w:qFormat="1"/>
+    <w:lsdException w:name="Quote" w:uiPriority="29" w:qFormat="1"/>
+    <w:lsdException w:name="Intense Quote" w:uiPriority="30" w:qFormat="1"/>
+    <w:lsdException w:name="Medium List 2 Accent 1" w:uiPriority="66"/>
+    <w:lsdException w:name="Medium Grid 1 Accent 1" w:uiPriority="67"/>
+    <w:lsdException w:name="Medium Grid 2 Accent 1" w:uiPriority="68"/>
+    <w:lsdException w:name="Medium Grid 3 Accent 1" w:uiPriority="69"/>
+    <w:lsdException w:name="Dark List Accent 1" w:uiPriority="70"/>
+    <w:lsdException w:name="Colorful Shading Accent 1" w:uiPriority="71"/>
+    <w:lsdException w:name="Colorful List Accent 1" w:uiPriority="72"/>
+    <w:lsdException w:name="Colorful Grid Accent 1" w:uiPriority="73"/>
+    <w:lsdException w:name="Light Shading Accent 2" w:uiPriority="60"/>
+    <w:lsdException w:name="Light List Accent 2" w:uiPriority="61"/>
+    <w:lsdException w:name="Light Grid Accent 2" w:uiPriority="62"/>
+    <w:lsdException w:name="Medium Shading 1 Accent 2" w:uiPriority="63"/>
+    <w:lsdException w:name="Medium Shading 2 Accent 2" w:uiPriority="64"/>
+    <w:lsdException w:name="Medium List 1 Accent 2" w:uiPriority="65"/>
+    <w:lsdException w:name="Medium List 2 Accent 2" w:uiPriority="66"/>
+    <w:lsdException w:name="Medium Grid 1 Accent 2" w:uiPriority="67"/>
+    <w:lsdException w:name="Medium Grid 2 Accent 2" w:uiPriority="68"/>
+    <w:lsdException w:name="Medium Grid 3 Accent 2" w:uiPriority="69"/>
+    <w:lsdException w:name="Dark List Accent 2" w:uiPriority="70"/>
+    <w:lsdException w:name="Colorful Shading Accent 2" w:uiPriority="71"/>
+    <w:lsdException w:name="Colorful List Accent 2" w:uiPriority="72"/>
+    <w:lsdException w:name="Colorful Grid Accent 2" w:uiPriority="73"/>
+    <w:lsdException w:name="Light Shading Accent 3" w:uiPriority="60"/>
+    <w:lsdException w:name="Light List Accent 3" w:uiPriority="61"/>
+    <w:lsdException w:name="Light Grid Accent 3" w:uiPriority="62"/>
+    <w:lsdException w:name="Medium Shading 1 Accent 3" w:uiPriority="63"/>
+    <w:lsdException w:name="Medium Shading 2 Accent 3" w:uiPriority="64"/>
+    <w:lsdException w:name="Medium List 1 Accent 3" w:uiPriority="65"/>
+    <w:lsdException w:name="Medium List 2 Accent 3" w:uiPriority="66"/>
+    <w:lsdException w:name="Medium Grid 1 Accent 3" w:uiPriority="67"/>
+    <w:lsdException w:name="Medium Grid 2 Accent 3" w:uiPriority="68"/>
+    <w:lsdException w:name="Medium Grid 3 Accent 3" w:uiPriority="69"/>
+    <w:lsdException w:name="Dark List Accent 3" w:uiPriority="70"/>
+    <w:lsdException w:name="Colorful Shading Accent 3" w:uiPriority="71"/>
+    <w:lsdException w:name="Colorful List Accent 3" w:uiPriority="72"/>
+    <w:lsdException w:name="Colorful Grid Accent 3" w:uiPriority="73"/>
+    <w:lsdException w:name="Light Shading Accent 4" w:uiPriority="60"/>
+    <w:lsdException w:name="Light List Accent 4" w:uiPriority="61"/>
+    <w:lsdException w:name="Light Grid Accent 4" w:uiPriority="62"/>
+    <w:lsdException w:name="Medium Shading 1 Accent 4" w:uiPriority="63"/>
+    <w:lsdException w:name="Medium Shading 2 Accent 4" w:uiPriority="64"/>
+    <w:lsdException w:name="Medium List 1 Accent 4" w:uiPriority="65"/>
+    <w:lsdException w:name="Medium List 2 Accent 4" w:uiPriority="66"/>
+    <w:lsdException w:name="Medium Grid 1 Accent 4" w:uiPriority="67"/>
+    <w:lsdException w:name="Medium Grid 2 Accent 4" w:uiPriority="68"/>
+    <w:lsdException w:name="Medium Grid 3 Accent 4" w:uiPriority="69"/>
+    <w:lsdException w:name="Dark List Accent 4" w:uiPriority="70"/>
+    <w:lsdException w:name="Colorful Shading Accent 4" w:uiPriority="71"/>
+    <w:lsdException w:name="Colorful List Accent 4" w:uiPriority="72"/>
+    <w:lsdException w:name="Colorful Grid Accent 4" w:uiPriority="73"/>
+    <w:lsdException w:name="Light Shading Accent 5" w:uiPriority="60"/>
+    <w:lsdException w:name="Light List Accent 5" w:uiPriority="61"/>
+    <w:lsdException w:name="Light Grid Accent 5" w:uiPriority="62"/>
+    <w:lsdException w:name="Medium Shading 1 Accent 5" w:uiPriority="63"/>
+    <w:lsdException w:name="Medium Shading 2 Accent 5" w:uiPriority="64"/>
+    <w:lsdException w:name="Medium List 1 Accent 5" w:uiPriority="65"/>
+    <w:lsdException w:name="Medium List 2 Accent 5" w:uiPriority="66"/>
+    <w:lsdException w:name="Medium Grid 1 Accent 5" w:uiPriority="67"/>
+    <w:lsdException w:name="Medium Grid 2 Accent 5" w:uiPriority="68"/>
+    <w:lsdException w:name="Medium Grid 3 Accent 5" w:uiPriority="69"/>
+    <w:lsdException w:name="Dark List Accent 5" w:uiPriority="70"/>
+    <w:lsdException w:name="Colorful Shading Accent 5" w:uiPriority="71"/>
+    <w:lsdException w:name="Colorful List Accent 5" w:uiPriority="72"/>
+    <w:lsdException w:name="Colorful Grid Accent 5" w:uiPriority="73"/>
+    <w:lsdException w:name="Light Shading Accent 6" w:uiPriority="60"/>
+    <w:lsdException w:name="Light List Accent 6" w:uiPriority="61"/>
+    <w:lsdException w:name="Light Grid Accent 6" w:uiPriority="62"/>
+    <w:lsdException w:name="Medium Shading 1 Accent 6" w:uiPriority="63"/>
+    <w:lsdException w:name="Medium Shading 2 Accent 6" w:uiPriority="64"/>
+    <w:lsdException w:name="Medium List 1 Accent 6" w:uiPriority="65"/>
+    <w:lsdException w:name="Medium List 2 Accent 6" w:uiPriority="66"/>
+    <w:lsdException w:name="Medium Grid 1 Accent 6" w:uiPriority="67"/>
+    <w:lsdException w:name="Medium Grid 2 Accent 6" w:uiPriority="68"/>
+    <w:lsdException w:name="Medium Grid 3 Accent 6" w:uiPriority="69"/>
+    <w:lsdException w:name="Dark List Accent 6" w:uiPriority="70"/>
+    <w:lsdException w:name="Colorful Shading Accent 6" w:uiPriority="71"/>
+    <w:lsdException w:name="Colorful List Accent 6" w:uiPriority="72"/>
+    <w:lsdException w:name="Colorful Grid Accent 6" w:uiPriority="73"/>
+    <w:lsdException w:name="Subtle Emphasis" w:uiPriority="19" w:qFormat="1"/>
+    <w:lsdException w:name="Intense Emphasis" w:uiPriority="21" w:qFormat="1"/>
+    <w:lsdException w:name="Subtle Reference" w:uiPriority="31" w:qFormat="1"/>
+    <w:lsdException w:name="Intense Reference" w:uiPriority="32" w:qFormat="1"/>
+    <w:lsdException w:name="Book Title" w:uiPriority="33" w:qFormat="1"/>
+    <w:lsdException w:name="Bibliography" w:semiHidden="1" w:uiPriority="37" w:unhideWhenUsed="1"/>
+    <w:lsdException w:name="TOC Heading" w:semiHidden="1" w:uiPriority="39" w:unhideWhenUsed="1" w:qFormat="1"/>
+    <w:lsdException w:name="Plain Table 1" w:uiPriority="41"/>
+    <w:lsdException w:name="Plain Table 2" w:uiPriority="42"/>
+    <w:lsdException w:name="Plain Table 3" w:uiPriority="43"/>
+    <w:lsdException w:name="Plain Table 4" w:uiPriority="44"/>
+    <w:lsdException w:name="Plain Table 5" w:uiPriority="45"/>
+    <w:lsdException w:name="Grid Table Light" w:uiPriority="40"/>
+    <w:lsdException w:name="Grid Table 1 Light" w:uiPriority="46"/>
+    <w:lsdException w:name="Grid Table 2" w:uiPriority="47"/>
+    <w:lsdException w:name="Grid Table 3" w:uiPriority="48"/>
+    <w:lsdException w:name="Grid Table 4" w:uiPriority="49"/>
+    <w:lsdException w:name="Grid Table 5 Dark" w:uiPriority="50"/>
+    <w:lsdException w:name="Grid Table 6 Colorful" w:uiPriority="51"/>
+    <w:lsdException w:name="Grid Table 7 Colorful" w:uiPriority="52"/>
+    <w:lsdException w:name="Grid Table 1 Light Accent 1" w:uiPriority="46"/>
+    <w:lsdException w:name="Grid Table 2 Accent 1" w:uiPriority="47"/>
+    <w:lsdException w:name="Grid Table 3 Accent 1" w:uiPriority="48"/>
+    <w:lsdException w:name="Grid Table 4 Accent 1" w:uiPriority="49"/>
+    <w:lsdException w:name="Grid Table 5 Dark Accent 1" w:uiPriority="50"/>
+    <w:lsdException w:name="Grid Table 6 Colorful Accent 1" w:uiPriority="51"/>
+    <w:lsdException w:name="Grid Table 7 Colorful Accent 1" w:uiPriority="52"/>
+    <w:lsdException w:name="Grid Table 1 Light Accent 2" w:uiPriority="46"/>
+    <w:lsdException w:name="Grid Table 2 Accent 2" w:uiPriority="47"/>
+    <w:lsdException w:name="Grid Table 3 Accent 2" w:uiPriority="48"/>
+    <w:lsdException w:name="Grid Table 4 Accent 2" w:uiPriority="49"/>
+    <w:lsdException w:name="Grid Table 5 Dark Accent 2" w:uiPriority="50"/>
+    <w:lsdException w:name="Grid Table 6 Colorful Accent 2" w:uiPriority="51"/>
+    <w:lsdException w:name="Grid Table 7 Colorful Accent 2" w:uiPriority="52"/>
+    <w:lsdException w:name="Grid Table 1 Light Accent 3" w:uiPriority="46"/>
+    <w:lsdException w:name="Grid Table 2 Accent 3" w:uiPriority="47"/>
+    <w:lsdException w:name="Grid Table 3 Accent 3" w:uiPriority="48"/>
+    <w:lsdException w:name="Grid Table 4 Accent 3" w:uiPriority="49"/>
+    <w:lsdException w:name="Grid Table 5 Dark Accent 3" w:uiPriority="50"/>
+    <w:lsdException w:name="Grid Table 6 Colorful Accent 3" w:uiPriority="51"/>
+    <w:lsdException w:name="Grid Table 7 Colorful Accent 3" w:uiPriority="52"/>
+    <w:lsdException w:name="Grid Table 1 Light Accent 4" w:uiPriority="46"/>
+    <w:lsdException w:name="Grid Table 2 Accent 4" w:uiPriority="47"/>
+    <w:lsdException w:name="Grid Table 3 Accent 4" w:uiPriority="48"/>
+    <w:lsdException w:name="Grid Table 4 Accent 4" w:uiPriority="49"/>
+    <w:lsdException w:name="Grid Table 5 Dark Accent 4" w:uiPriority="50"/>
+    <w:lsdException w:name="Grid Table 6 Colorful Accent 4" w:uiPriority="51"/>
+    <w:lsdException w:name="Grid Table 7 Colorful Accent 4" w:uiPriority="52"/>
+    <w:lsdException w:name="Grid Table 1 Light Accent 5" w:uiPriority="46"/>
+    <w:lsdException w:name="Grid Table 2 Accent 5" w:uiPriority="47"/>
+    <w:lsdException w:name="Grid Table 3 Accent 5" w:uiPriority="48"/>
+    <w:lsdException w:name="Grid Table 4 Accent 5" w:uiPriority="49"/>
+    <w:lsdException w:name="Grid Table 5 Dark Accent 5" w:uiPriority="50"/>
+    <w:lsdException w:name="Grid Table 6 Colorful Accent 5" w:uiPriority="51"/>
+    <w:lsdException w:name="Grid Table 7 Colorful Accent 5" w:uiPriority="52"/>
+    <w:lsdException w:name="Grid Table 1 Light Accent 6" w:uiPriority="46"/>
+    <w:lsdException w:name="Grid Table 2 Accent 6" w:uiPriority="47"/>
+    <w:lsdException w:name="Grid Table 3 Accent 6" w:uiPriority="48"/>
+    <w:lsdException w:name="Grid Table 4 Accent 6" w:uiPriority="49"/>
+    <w:lsdException w:name="Grid Table 5 Dark Accent 6" w:uiPriority="50"/>
+    <w:lsdException w:name="Grid Table 6 Colorful Accent 6" w:uiPriority="51"/>
+    <w:lsdException w:name="Grid Table 7 Colorful Accent 6" w:uiPriority="52"/>
+    <w:lsdException w:name="List Table 1 Light" w:uiPriority="46"/>
+    <w:lsdException w:name="List Table 2" w:uiPriority="47"/>
+    <w:lsdException w:name="List Table 3" w:uiPriority="48"/>
+    <w:lsdException w:name="List Table 4" w:uiPriority="49"/>
+    <w:lsdException w:name="List Table 5 Dark" w:uiPriority="50"/>
+    <w:lsdException w:name="List Table 6 Colorful" w:uiPriority="51"/>
+    <w:lsdException w:name="List Table 7 Colorful" w:uiPriority="52"/>
+    <w:lsdException w:name="List Table 1 Light Accent 1" w:uiPriority="46"/>
+    <w:lsdException w:name="List Table 2 Accent 1" w:uiPriority="47"/>
+    <w:lsdException w:name="List Table 3 Accent 1" w:uiPriority="48"/>
+    <w:lsdException w:name="List Table 4 Accent 1" w:uiPriority="49"/>
+    <w:lsdException w:name="List Table 5 Dark Accent 1" w:uiPriority="50"/>
+    <w:lsdException w:name="List Table 6 Colorful Accent 1" w:uiPriority="51"/>
+    <w:lsdException w:name="List Table 7 Colorful Accent 1" w:uiPriority="52"/>
+    <w:lsdException w:name="List Table 1 Light Accent 2" w:uiPriority="46"/>
+    <w:lsdException w:name="List Table 2 Accent 2" w:uiPriority="47"/>
+    <w:lsdException w:name="List Table 3 Accent 2" w:uiPriority="48"/>
+    <w:lsdException w:name="List Table 4 Accent 2" w:uiPriority="49"/>
+    <w:lsdException w:name="List Table 5 Dark Accent 2" w:uiPriority="50"/>
+    <w:lsdException w:name="List Table 6 Colorful Accent 2" w:uiPriority="51"/>
+    <w:lsdException w:name="List Table 7 Colorful Accent 2" w:uiPriority="52"/>
+    <w:lsdException w:name="List Table 1 Light Accent 3" w:uiPriority="46"/>
+    <w:lsdException w:name="List Table 2 Accent 3" w:uiPriority="47"/>
+    <w:lsdException w:name="List Table 3 Accent 3" w:uiPriority="48"/>
+    <w:lsdException w:name="List Table 4 Accent 3" w:uiPriority="49"/>
+    <w:lsdException w:name="List Table 5 Dark Accent 3" w:uiPriority="50"/>
+    <w:lsdException w:name="List Table 6 Colorful Accent 3" w:uiPriority="51"/>
+    <w:lsdException w:name="List Table 7 Colorful Accent 3" w:uiPriority="52"/>
+    <w:lsdException w:name="List Table 1 Light Accent 4" w:uiPriority="46"/>
+    <w:lsdException w:name="List Table 2 Accent 4" w:uiPriority="47"/>
+    <w:lsdException w:name="List Table 3 Accent 4" w:uiPriority="48"/>
+    <w:lsdException w:name="List Table 4 Accent 4" w:uiPriority="49"/>
+    <w:lsdException w:name="List Table 5 Dark Accent 4" w:uiPriority="50"/>
+    <w:lsdException w:name="List Table 6 Colorful Accent 4" w:uiPriority="51"/>
+    <w:lsdException w:name="List Table 7 Colorful Accent 4" w:uiPriority="52"/>
+    <w:lsdException w:name="List Table 1 Light Accent 5" w:uiPriority="46"/>
+    <w:lsdException w:name="List Table 2 Accent 5" w:uiPriority="47"/>
+    <w:lsdException w:name="List Table 3 Accent 5" w:uiPriority="48"/>
+    <w:lsdException w:name="List Table 4 Accent 5" w:uiPriority="49"/>
+    <w:lsdException w:name="List Table 5 Dark Accent 5" w:uiPriority="50"/>
+    <w:lsdException w:name="List Table 6 Colorful Accent 5" w:uiPriority="51"/>
+    <w:lsdException w:name="List Table 7 Colorful Accent 5" w:uiPriority="52"/>
+    <w:lsdException w:name="List Table 1 Light Accent 6" w:uiPriority="46"/>
+    <w:lsdException w:name="List Table 2 Accent 6" w:uiPriority="47"/>
+    <w:lsdException w:name="List Table 3 Accent 6" w:uiPriority="48"/>
+    <w:lsdException w:name="List Table 4 Accent 6" w:uiPriority="49"/>
+    <w:lsdException w:name="List Table 5 Dark Accent 6" w:uiPriority="50"/>
+    <w:lsdException w:name="List Table 6 Colorful Accent 6" w:uiPriority="51"/>
+    <w:lsdException w:name="List Table 7 Colorful Accent 6" w:uiPriority="52"/>
+    <w:lsdException w:name="Mention" w:semiHidden="1" w:unhideWhenUsed="1"/>
+    <w:lsdException w:name="Smart Hyperlink" w:semiHidden="1" w:unhideWhenUsed="1"/>
+    <w:lsdException w:name="Hashtag" w:semiHidden="1" w:unhideWhenUsed="1"/>
+    <w:lsdException w:name="Unresolved Mention" w:semiHidden="1" w:unhideWhenUsed="1"/>
+    <w:lsdException w:name="Smart Link" w:semiHidden="1" w:unhideWhenUsed="1"/>
+  </w:latentStyles>
+  <w:style w:type="paragraph" w:default="1" w:styleId="Normal">
+    <w:name w:val="Normal"/>
+    <w:qFormat/>
+  </w:style>
+  <w:style w:type="character" w:default="1" w:styleId="DefaultParagraphFont">
+    <w:name w:val="Default Paragraph Font"/>
+    <w:uiPriority w:val="1"/>
+    <w:semiHidden/>
+    <w:unhideWhenUsed/>
+  </w:style>
+  <w:style w:type="table" w:default="1" w:styleId="TableNormal">
+    <w:name w:val="Normal Table"/>
+    <w:uiPriority w:val="99"/>
+    <w:semiHidden/>
+    <w:unhideWhenUsed/>
+    <w:tblPr>
+      <w:tblInd w:w="0" w:type="dxa"/>
+      <w:tblCellMar>
+        <w:top w:w="0" w:type="dxa"/>
+        <w:left w:w="108" w:type="dxa"/>
+        <w:bottom w:w="0" w:type="dxa"/>
+        <w:right w:w="108" w:type="dxa"/>
+      </w:tblCellMar>
+    </w:tblPr>
+  </w:style>
+  <w:style w:type="numbering" w:default="1" w:styleId="NoList">
+    <w:name w:val="No List"/>
+    <w:uiPriority w:val="99"/>
+    <w:semiHidden/>
+    <w:unhideWhenUsed/>
+  </w:style>
+  <w:style w:type="character" w:styleId="PlaceholderText">
+    <w:name w:val="Placeholder Text"/>
+    <w:basedOn w:val="DefaultParagraphFont"/>
+    <w:uiPriority w:val="99"/>
+    <w:semiHidden/>
+    <w:rsid w:val="00D82711"/>
+    <w:rPr>
+      <w:color w:val="666666"/>
+    </w:rPr>
+  </w:style>
+</w:styles>
+</file>
+
+<file path=word/glossary/webSettings.xml><?xml version="1.0" encoding="utf-8"?>
+<w:webSettings xmlns:mc="http://schemas.openxmlformats.org/markup-compatibility/2006" xmlns:r="http://schemas.openxmlformats.org/officeDocument/2006/relationships" xmlns:w="http://schemas.openxmlformats.org/wordprocessingml/2006/main" xmlns:w14="http://schemas.microsoft.com/office/word/2010/wordml" xmlns:w15="http://schemas.microsoft.com/office/word/2012/wordml" xmlns:w16cex="http://schemas.microsoft.com/office/word/2018/wordml/cex" xmlns:w16cid="http://schemas.microsoft.com/office/word/2016/wordml/cid" xmlns:w16="http://schemas.microsoft.com/office/word/2018/wordml" xmlns:w16du="http://schemas.microsoft.com/office/word/2023/wordml/word16du" xmlns:w16sdtdh="http://schemas.microsoft.com/office/word/2020/wordml/sdtdatahash" xmlns:w16sdtfl="http://schemas.microsoft.com/office/word/2024/wordml/sdtformatlock" xmlns:w16se="http://schemas.microsoft.com/office/word/2015/wordml/symex" mc:Ignorable="w14 w15 w16se w16cid w16 w16cex w16sdtdh w16sdtfl w16du">
+  <w:optimizeForBrowser/>
+  <w:allowPNG/>
+</w:webSettings>
 </file>
 
 <file path=word/theme/theme1.xml><?xml version="1.0" encoding="utf-8"?>
@@ -1246,4 +2442,40 @@
     </a:ext>
   </a:extLst>
 </a:theme>
+</file>
+
+<file path=word/webextensions/taskpanes.xml><?xml version="1.0" encoding="utf-8"?>
+<wetp:taskpanes xmlns:wetp="http://schemas.microsoft.com/office/webextensions/taskpanes/2010/11">
+  <wetp:taskpane dockstate="right" visibility="0" width="350" row="0">
+    <wetp:webextensionref xmlns:r="http://schemas.openxmlformats.org/officeDocument/2006/relationships" r:id="rId1"/>
+  </wetp:taskpane>
+</wetp:taskpanes>
+</file>
+
+<file path=word/webextensions/webextension1.xml><?xml version="1.0" encoding="utf-8"?>
+<we:webextension xmlns:we="http://schemas.microsoft.com/office/webextensions/webextension/2010/11" id="{F5C6079C-EC47-9F40-96DC-4A9C2C700F61}">
+  <we:reference id="wa104382081" version="1.55.1.0" store="en-US" storeType="OMEX"/>
+  <we:alternateReferences>
+    <we:reference id="WA104382081" version="1.55.1.0" store="" storeType="OMEX"/>
+  </we:alternateReferences>
+  <we:properties>
+    <we:property name="MENDELEY_CITATIONS" value="[{&quot;citationID&quot;:&quot;MENDELEY_CITATION_d23a6aab-6de4-4fb3-a0be-c4486878b3e6&quot;,&quot;properties&quot;:{&quot;noteIndex&quot;:0},&quot;isEdited&quot;:false,&quot;manualOverride&quot;:{&quot;isManuallyOverridden&quot;:false,&quot;citeprocText&quot;:&quot;(1)&quot;,&quot;manualOverrideText&quot;:&quot;&quot;},&quot;citationTag&quot;:&quot;MENDELEY_CITATION_v3_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&quot;,&quot;citationItems&quot;:[{&quot;id&quot;:&quot;03a45da2-b9e9-3531-9f01-5f61fac20cb2&quot;,&quot;itemData&quot;:{&quot;type&quot;:&quot;article-journal&quot;,&quot;id&quot;:&quot;03a45da2-b9e9-3531-9f01-5f61fac20cb2&quot;,&quot;title&quot;:&quot;The global health and economic burden of chikungunya from 2011 to 2020: a model-driven analysis on the impact of an emerging vector-borne disease&quot;,&quot;author&quot;:[{&quot;family&quot;:&quot;Roo&quot;,&quot;given&quot;:&quot;Adrianne Marije&quot;,&quot;parse-names&quot;:false,&quot;dropping-particle&quot;:&quot;&quot;,&quot;non-dropping-particle&quot;:&quot;De&quot;},{&quot;family&quot;:&quot;Vondeling&quot;,&quot;given&quot;:&quot;Gerard Timmy&quot;,&quot;parse-names&quot;:false,&quot;dropping-particle&quot;:&quot;&quot;,&quot;non-dropping-particle&quot;:&quot;&quot;},{&quot;family&quot;:&quot;Boer&quot;,&quot;given&quot;:&quot;Martijn&quot;,&quot;parse-names&quot;:false,&quot;dropping-particle&quot;:&quot;&quot;,&quot;non-dropping-particle&quot;:&quot;&quot;},{&quot;family&quot;:&quot;Murray&quot;,&quot;given&quot;:&quot;Kristy&quot;,&quot;parse-names&quot;:false,&quot;dropping-particle&quot;:&quot;&quot;,&quot;non-dropping-particle&quot;:&quot;&quot;},{&quot;family&quot;:&quot;Postma&quot;,&quot;given&quot;:&quot;Maarten Jacobus&quot;,&quot;parse-names&quot;:false,&quot;dropping-particle&quot;:&quot;&quot;,&quot;non-dropping-particle&quot;:&quot;&quot;}],&quot;container-title&quot;:&quot;BMJ Global Health&quot;,&quot;container-title-short&quot;:&quot;BMJ Glob Health&quot;,&quot;accessed&quot;:{&quot;date-parts&quot;:[[2025,7,29]]},&quot;DOI&quot;:&quot;10.1136/BMJGH-2024-016648&quot;,&quot;ISSN&quot;:&quot;2059-7908&quot;,&quot;PMID&quot;:&quot;10.1136/bmjgh-2024-016648&quot;,&quot;URL&quot;:&quot;https://gh.bmj.com/content/9/12/e016648&quot;,&quot;issued&quot;:{&quot;date-parts&quot;:[[2024,12,3]]},&quot;abstract&quot;:&quot;Introduction Chikungunya is a mosquito-borne arboviral disease posing an emerging global public health threat. Understanding the global burden of chikungunya is critical for designing effective prevention and control strategies. However, current estimates of the economic and health impact of chikungunya remain limited and are potentially underestimated. This study aims to provide a comprehensive overview of the chikungunya burden worldwide.Methods We analysed the global burden of chikungunya between 2011 and 2020 and calculated disability-adjusted life years (DALYs) and direct and indirect costs using a data-driven simulation model. The main outcomes were the number of cases, the total DALY burden, and the direct and indirect costs of acute and chronic chikungunya between 2011 and 2020.Results Our study revealed a total of 18.7 million chikungunya cases in 110 countries between 2011 and 2020, causing 1.95 million DALYs. Most of this burden was found in the Latin American and Caribbean region. The total economic burden caused by chikungunya over these 10 years was estimated at $2.8 billion in direct costs and $47.1 billion in indirect costs worldwide. Long-term chronic illness was the source of most costs and DALYs.Conclusion Chikungunya has a higher disease burden than was previously estimated and costs related to the disease are substantial. Especially in combination with its unpredictable nature, chikungunya could significantly impact local health systems. Insights from this study could inform decision makers on the impact of chikungunya on population health and help them to appropriately allocate resources to protect vulnerable populations from this debilitating disease.&quot;,&quot;publisher&quot;:&quot;BMJ Publishing Group Ltd&quot;,&quot;issue&quot;:&quot;12&quot;,&quot;volume&quot;:&quot;9&quot;},&quot;isTemporary&quot;:false}]},{&quot;citationID&quot;:&quot;MENDELEY_CITATION_e225cc0d-7933-4950-bde1-cb2a750bbb0c&quot;,&quot;properties&quot;:{&quot;noteIndex&quot;:0},&quot;isEdited&quot;:false,&quot;manualOverride&quot;:{&quot;isManuallyOverridden&quot;:false,&quot;citeprocText&quot;:&quot;(1)&quot;,&quot;manualOverrideText&quot;:&quot;&quot;},&quot;citationTag&quot;:&quot;MENDELEY_CITATION_v3_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&quot;,&quot;citationItems&quot;:[{&quot;id&quot;:&quot;03a45da2-b9e9-3531-9f01-5f61fac20cb2&quot;,&quot;itemData&quot;:{&quot;type&quot;:&quot;article-journal&quot;,&quot;id&quot;:&quot;03a45da2-b9e9-3531-9f01-5f61fac20cb2&quot;,&quot;title&quot;:&quot;The global health and economic burden of chikungunya from 2011 to 2020: a model-driven analysis on the impact of an emerging vector-borne disease&quot;,&quot;author&quot;:[{&quot;family&quot;:&quot;Roo&quot;,&quot;given&quot;:&quot;Adrianne Marije&quot;,&quot;parse-names&quot;:false,&quot;dropping-particle&quot;:&quot;&quot;,&quot;non-dropping-particle&quot;:&quot;De&quot;},{&quot;family&quot;:&quot;Vondeling&quot;,&quot;given&quot;:&quot;Gerard Timmy&quot;,&quot;parse-names&quot;:false,&quot;dropping-particle&quot;:&quot;&quot;,&quot;non-dropping-particle&quot;:&quot;&quot;},{&quot;family&quot;:&quot;Boer&quot;,&quot;given&quot;:&quot;Martijn&quot;,&quot;parse-names&quot;:false,&quot;dropping-particle&quot;:&quot;&quot;,&quot;non-dropping-particle&quot;:&quot;&quot;},{&quot;family&quot;:&quot;Murray&quot;,&quot;given&quot;:&quot;Kristy&quot;,&quot;parse-names&quot;:false,&quot;dropping-particle&quot;:&quot;&quot;,&quot;non-dropping-particle&quot;:&quot;&quot;},{&quot;family&quot;:&quot;Postma&quot;,&quot;given&quot;:&quot;Maarten Jacobus&quot;,&quot;parse-names&quot;:false,&quot;dropping-particle&quot;:&quot;&quot;,&quot;non-dropping-particle&quot;:&quot;&quot;}],&quot;container-title&quot;:&quot;BMJ Global Health&quot;,&quot;container-title-short&quot;:&quot;BMJ Glob Health&quot;,&quot;accessed&quot;:{&quot;date-parts&quot;:[[2025,7,29]]},&quot;DOI&quot;:&quot;10.1136/BMJGH-2024-016648&quot;,&quot;ISSN&quot;:&quot;2059-7908&quot;,&quot;PMID&quot;:&quot;10.1136/bmjgh-2024-016648&quot;,&quot;URL&quot;:&quot;https://gh.bmj.com/content/9/12/e016648&quot;,&quot;issued&quot;:{&quot;date-parts&quot;:[[2024,12,3]]},&quot;abstract&quot;:&quot;Introduction Chikungunya is a mosquito-borne arboviral disease posing an emerging global public health threat. Understanding the global burden of chikungunya is critical for designing effective prevention and control strategies. However, current estimates of the economic and health impact of chikungunya remain limited and are potentially underestimated. This study aims to provide a comprehensive overview of the chikungunya burden worldwide.Methods We analysed the global burden of chikungunya between 2011 and 2020 and calculated disability-adjusted life years (DALYs) and direct and indirect costs using a data-driven simulation model. The main outcomes were the number of cases, the total DALY burden, and the direct and indirect costs of acute and chronic chikungunya between 2011 and 2020.Results Our study revealed a total of 18.7 million chikungunya cases in 110 countries between 2011 and 2020, causing 1.95 million DALYs. Most of this burden was found in the Latin American and Caribbean region. The total economic burden caused by chikungunya over these 10 years was estimated at $2.8 billion in direct costs and $47.1 billion in indirect costs worldwide. Long-term chronic illness was the source of most costs and DALYs.Conclusion Chikungunya has a higher disease burden than was previously estimated and costs related to the disease are substantial. Especially in combination with its unpredictable nature, chikungunya could significantly impact local health systems. Insights from this study could inform decision makers on the impact of chikungunya on population health and help them to appropriately allocate resources to protect vulnerable populations from this debilitating disease.&quot;,&quot;publisher&quot;:&quot;BMJ Publishing Group Ltd&quot;,&quot;issue&quot;:&quot;12&quot;,&quot;volume&quot;:&quot;9&quot;},&quot;isTemporary&quot;:false}]},{&quot;citationID&quot;:&quot;MENDELEY_CITATION_d5c517f3-649a-4f74-9d1e-998fd6bc6808&quot;,&quot;properties&quot;:{&quot;noteIndex&quot;:0},&quot;isEdited&quot;:false,&quot;manualOverride&quot;:{&quot;isManuallyOverridden&quot;:false,&quot;citeprocText&quot;:&quot;(2)&quot;,&quot;manualOverrideText&quot;:&quot;&quot;},&quot;citationTag&quot;:&quot;MENDELEY_CITATION_v3_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&quot;,&quot;citationItems&quot;:[{&quot;id&quot;:&quot;9800b69c-484c-3109-bcec-1e79b70d9bf0&quot;,&quot;itemData&quot;:{&quot;type&quot;:&quot;article-journal&quot;,&quot;id&quot;:&quot;9800b69c-484c-3109-bcec-1e79b70d9bf0&quot;,&quot;title&quot;:&quot;Chikungunya fever&quot;,&quot;author&quot;:[{&quot;family&quot;:&quot;Bartholomeeusen&quot;,&quot;given&quot;:&quot;Koen&quot;,&quot;parse-names&quot;:false,&quot;dropping-particle&quot;:&quot;&quot;,&quot;non-dropping-particle&quot;:&quot;&quot;},{&quot;family&quot;:&quot;Daniel&quot;,&quot;given&quot;:&quot;Matthieu&quot;,&quot;parse-names&quot;:false,&quot;dropping-particle&quot;:&quot;&quot;,&quot;non-dropping-particle&quot;:&quot;&quot;},{&quot;family&quot;:&quot;LaBeaud&quot;,&quot;given&quot;:&quot;Desiree A.&quot;,&quot;parse-names&quot;:false,&quot;dropping-particle&quot;:&quot;&quot;,&quot;non-dropping-particle&quot;:&quot;&quot;},{&quot;family&quot;:&quot;Gasque&quot;,&quot;given&quot;:&quot;Philippe&quot;,&quot;parse-names&quot;:false,&quot;dropping-particle&quot;:&quot;&quot;,&quot;non-dropping-particle&quot;:&quot;&quot;},{&quot;family&quot;:&quot;Peeling&quot;,&quot;given&quot;:&quot;Rosanna W.&quot;,&quot;parse-names&quot;:false,&quot;dropping-particle&quot;:&quot;&quot;,&quot;non-dropping-particle&quot;:&quot;&quot;},{&quot;family&quot;:&quot;Stephenson&quot;,&quot;given&quot;:&quot;Kathryn E.&quot;,&quot;parse-names&quot;:false,&quot;dropping-particle&quot;:&quot;&quot;,&quot;non-dropping-particle&quot;:&quot;&quot;},{&quot;family&quot;:&quot;Ng&quot;,&quot;given&quot;:&quot;Lisa F.P.&quot;,&quot;parse-names&quot;:false,&quot;dropping-particle&quot;:&quot;&quot;,&quot;non-dropping-particle&quot;:&quot;&quot;},{&quot;family&quot;:&quot;Ariën&quot;,&quot;given&quot;:&quot;Kevin K.&quot;,&quot;parse-names&quot;:false,&quot;dropping-particle&quot;:&quot;&quot;,&quot;non-dropping-particle&quot;:&quot;&quot;}],&quot;container-title&quot;:&quot;Nature Reviews Disease Primers 2023 9:1&quot;,&quot;accessed&quot;:{&quot;date-parts&quot;:[[2025,7,29]]},&quot;DOI&quot;:&quot;10.1038/s41572-023-00429-2&quot;,&quot;ISSN&quot;:&quot;2056-676X&quot;,&quot;PMID&quot;:&quot;37024497&quot;,&quot;URL&quot;:&quot;https://www.nature.com/articles/s41572-023-00429-2&quot;,&quot;issued&quot;:{&quot;date-parts&quot;:[[2023,4,6]]},&quot;page&quot;:&quot;1-21&quot;,&quot;abstract&quot;:&quot;Chikungunya virus is widespread throughout the tropics, where it causes recurrent outbreaks of chikungunya fever. In recent years, outbreaks have afflicted populations in East and Central Africa, South America and Southeast Asia. The virus is transmitted by Aedes aegypti and Aedes albopictus mosquitoes. Chikungunya fever is characterized by severe arthralgia and myalgia that can persist for years and have considerable detrimental effects on health, quality of life and economic productivity. The effects of climate change as well as increased globalization of commerce and travel have led to growth of the habitat of Aedes mosquitoes. As a result, increasing numbers of people will be at risk of chikungunya fever in the coming years. In the absence of specific antiviral treatments and with vaccines still in development, surveillance and vector control are essential to suppress re-emergence and epidemics. Chikungunya fever is an acute febrile illness caused by chikungunya virus, a mosquito-borne alphavirus. This Primer by Bartholomeeusen and colleagues summarizes the epidemiology, mechanisms, diagnosis and treatment of chikungunya fever, and discusses patient quality of life and open research questions for this condition.&quot;,&quot;publisher&quot;:&quot;Nature Publishing Group&quot;,&quot;issue&quot;:&quot;1&quot;,&quot;volume&quot;:&quot;9&quot;,&quot;container-title-short&quot;:&quot;&quot;},&quot;isTemporary&quot;:false}]},{&quot;citationID&quot;:&quot;MENDELEY_CITATION_560aa947-a08c-48ba-99b6-9e6257b53aaf&quot;,&quot;properties&quot;:{&quot;noteIndex&quot;:0},&quot;isEdited&quot;:false,&quot;manualOverride&quot;:{&quot;isManuallyOverridden&quot;:false,&quot;citeprocText&quot;:&quot;(2)&quot;,&quot;manualOverrideText&quot;:&quot;&quot;},&quot;citationTag&quot;:&quot;MENDELEY_CITATION_v3_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&quot;,&quot;citationItems&quot;:[{&quot;id&quot;:&quot;9800b69c-484c-3109-bcec-1e79b70d9bf0&quot;,&quot;itemData&quot;:{&quot;type&quot;:&quot;article-journal&quot;,&quot;id&quot;:&quot;9800b69c-484c-3109-bcec-1e79b70d9bf0&quot;,&quot;title&quot;:&quot;Chikungunya fever&quot;,&quot;author&quot;:[{&quot;family&quot;:&quot;Bartholomeeusen&quot;,&quot;given&quot;:&quot;Koen&quot;,&quot;parse-names&quot;:false,&quot;dropping-particle&quot;:&quot;&quot;,&quot;non-dropping-particle&quot;:&quot;&quot;},{&quot;family&quot;:&quot;Daniel&quot;,&quot;given&quot;:&quot;Matthieu&quot;,&quot;parse-names&quot;:false,&quot;dropping-particle&quot;:&quot;&quot;,&quot;non-dropping-particle&quot;:&quot;&quot;},{&quot;family&quot;:&quot;LaBeaud&quot;,&quot;given&quot;:&quot;Desiree A.&quot;,&quot;parse-names&quot;:false,&quot;dropping-particle&quot;:&quot;&quot;,&quot;non-dropping-particle&quot;:&quot;&quot;},{&quot;family&quot;:&quot;Gasque&quot;,&quot;given&quot;:&quot;Philippe&quot;,&quot;parse-names&quot;:false,&quot;dropping-particle&quot;:&quot;&quot;,&quot;non-dropping-particle&quot;:&quot;&quot;},{&quot;family&quot;:&quot;Peeling&quot;,&quot;given&quot;:&quot;Rosanna W.&quot;,&quot;parse-names&quot;:false,&quot;dropping-particle&quot;:&quot;&quot;,&quot;non-dropping-particle&quot;:&quot;&quot;},{&quot;family&quot;:&quot;Stephenson&quot;,&quot;given&quot;:&quot;Kathryn E.&quot;,&quot;parse-names&quot;:false,&quot;dropping-particle&quot;:&quot;&quot;,&quot;non-dropping-particle&quot;:&quot;&quot;},{&quot;family&quot;:&quot;Ng&quot;,&quot;given&quot;:&quot;Lisa F.P.&quot;,&quot;parse-names&quot;:false,&quot;dropping-particle&quot;:&quot;&quot;,&quot;non-dropping-particle&quot;:&quot;&quot;},{&quot;family&quot;:&quot;Ariën&quot;,&quot;given&quot;:&quot;Kevin K.&quot;,&quot;parse-names&quot;:false,&quot;dropping-particle&quot;:&quot;&quot;,&quot;non-dropping-particle&quot;:&quot;&quot;}],&quot;container-title&quot;:&quot;Nature Reviews Disease Primers 2023 9:1&quot;,&quot;accessed&quot;:{&quot;date-parts&quot;:[[2025,7,29]]},&quot;DOI&quot;:&quot;10.1038/s41572-023-00429-2&quot;,&quot;ISSN&quot;:&quot;2056-676X&quot;,&quot;PMID&quot;:&quot;37024497&quot;,&quot;URL&quot;:&quot;https://www.nature.com/articles/s41572-023-00429-2&quot;,&quot;issued&quot;:{&quot;date-parts&quot;:[[2023,4,6]]},&quot;page&quot;:&quot;1-21&quot;,&quot;abstract&quot;:&quot;Chikungunya virus is widespread throughout the tropics, where it causes recurrent outbreaks of chikungunya fever. In recent years, outbreaks have afflicted populations in East and Central Africa, South America and Southeast Asia. The virus is transmitted by Aedes aegypti and Aedes albopictus mosquitoes. Chikungunya fever is characterized by severe arthralgia and myalgia that can persist for years and have considerable detrimental effects on health, quality of life and economic productivity. The effects of climate change as well as increased globalization of commerce and travel have led to growth of the habitat of Aedes mosquitoes. As a result, increasing numbers of people will be at risk of chikungunya fever in the coming years. In the absence of specific antiviral treatments and with vaccines still in development, surveillance and vector control are essential to suppress re-emergence and epidemics. Chikungunya fever is an acute febrile illness caused by chikungunya virus, a mosquito-borne alphavirus. This Primer by Bartholomeeusen and colleagues summarizes the epidemiology, mechanisms, diagnosis and treatment of chikungunya fever, and discusses patient quality of life and open research questions for this condition.&quot;,&quot;publisher&quot;:&quot;Nature Publishing Group&quot;,&quot;issue&quot;:&quot;1&quot;,&quot;volume&quot;:&quot;9&quot;,&quot;container-title-short&quot;:&quot;&quot;},&quot;isTemporary&quot;:false}]}]"/>
+    <we:property name="MENDELEY_CITATIONS_LOCALE_CODE" value="&quot;en-GB&quot;"/>
+    <we:property name="MENDELEY_CITATIONS_STYLE" value="{&quot;id&quot;:&quot;https://www.zotero.org/styles/vancouver&quot;,&quot;title&quot;:&quot;Vancouver&quot;,&quot;format&quot;:&quot;numeric&quot;,&quot;defaultLocale&quot;:null,&quot;isLocaleCodeValid&quot;:true}"/>
+  </we:properties>
+  <we:bindings/>
+  <we:snapshot xmlns:r="http://schemas.openxmlformats.org/officeDocument/2006/relationships"/>
+</we:webextension>
+</file>
+
+<file path=customXml/item1.xml><?xml version="1.0" encoding="utf-8"?>
+<b:Sources xmlns:b="http://schemas.openxmlformats.org/officeDocument/2006/bibliography" xmlns="http://schemas.openxmlformats.org/officeDocument/2006/bibliography" SelectedStyle="/APASixthEditionOfficeOnline.xsl" StyleName="APA" Version="6"/>
+</file>
+
+<file path=customXml/itemProps1.xml><?xml version="1.0" encoding="utf-8"?>
+<ds:datastoreItem xmlns:ds="http://schemas.openxmlformats.org/officeDocument/2006/customXml" ds:itemID="{8D2D4868-31D6-6A4E-8A9B-6B5D98E8CCFB}">
+  <ds:schemaRefs>
+    <ds:schemaRef ds:uri="http://schemas.openxmlformats.org/officeDocument/2006/bibliography"/>
+  </ds:schemaRefs>
+</ds:datastoreItem>
 </file>
</xml_diff>